<commit_message>
add diagrams update doc
</commit_message>
<xml_diff>
--- a/документация/diary.docx
+++ b/документация/diary.docx
@@ -12,7 +12,6 @@
           <w:color w:val="000000"/>
           <w:sz w:val="28"/>
           <w:szCs w:val="28"/>
-          <w:lang w:val="ru-RU"/>
         </w:rPr>
       </w:pPr>
     </w:p>
@@ -171,7 +170,26 @@
           <w:szCs w:val="28"/>
           <w:lang w:val="en-US"/>
         </w:rPr>
-        <w:t>MY DIARY</w:t>
+        <w:t>MY</w:t>
+      </w:r>
+      <w:r>
+        <w:rPr>
+          <w:b/>
+          <w:bCs/>
+          <w:sz w:val="28"/>
+          <w:szCs w:val="28"/>
+        </w:rPr>
+        <w:t xml:space="preserve"> </w:t>
+      </w:r>
+      <w:r>
+        <w:rPr>
+          <w:b/>
+          <w:bCs/>
+          <w:sz w:val="28"/>
+          <w:szCs w:val="28"/>
+          <w:lang w:val="en-US"/>
+        </w:rPr>
+        <w:t>DIARY</w:t>
       </w:r>
       <w:r>
         <w:rPr>
@@ -429,7 +447,6 @@
               <w:rPr>
                 <w:sz w:val="28"/>
                 <w:szCs w:val="28"/>
-                <w:lang w:val="ru-RU"/>
               </w:rPr>
               <w:t>М</w:t>
             </w:r>
@@ -444,7 +461,6 @@
               <w:rPr>
                 <w:sz w:val="28"/>
                 <w:szCs w:val="28"/>
-                <w:lang w:val="ru-RU"/>
               </w:rPr>
               <w:t>В</w:t>
             </w:r>
@@ -459,7 +475,6 @@
               <w:rPr>
                 <w:sz w:val="28"/>
                 <w:szCs w:val="28"/>
-                <w:lang w:val="ru-RU"/>
               </w:rPr>
               <w:t>Рощинина</w:t>
             </w:r>
@@ -635,7 +650,6 @@
       <w:sdtPr>
         <w:rPr>
           <w:noProof/>
-          <w:lang w:val="ru-RU"/>
         </w:rPr>
         <w:id w:val="1147004706"/>
         <w:docPartObj>
@@ -650,7 +664,6 @@
             <w:jc w:val="both"/>
             <w:rPr>
               <w:noProof/>
-              <w:lang w:val="ru-RU"/>
             </w:rPr>
           </w:pPr>
         </w:p>
@@ -661,7 +674,6 @@
               <w:rFonts w:asciiTheme="minorHAnsi" w:eastAsiaTheme="minorEastAsia" w:hAnsiTheme="minorHAnsi" w:cstheme="minorBidi"/>
               <w:noProof/>
               <w:kern w:val="2"/>
-              <w:lang w:val="ru-RU"/>
             </w:rPr>
           </w:pPr>
           <w:r>
@@ -670,7 +682,6 @@
               <w:color w:val="000000"/>
               <w:sz w:val="28"/>
               <w:szCs w:val="28"/>
-              <w:lang w:val="ru-RU"/>
             </w:rPr>
             <w:fldChar w:fldCharType="begin"/>
           </w:r>
@@ -680,7 +691,6 @@
               <w:color w:val="000000"/>
               <w:sz w:val="28"/>
               <w:szCs w:val="28"/>
-              <w:lang w:val="ru-RU"/>
             </w:rPr>
             <w:instrText xml:space="preserve"> TOC \o "1-3" \h \z \u </w:instrText>
           </w:r>
@@ -690,7 +700,6 @@
               <w:color w:val="000000"/>
               <w:sz w:val="28"/>
               <w:szCs w:val="28"/>
-              <w:lang w:val="ru-RU"/>
             </w:rPr>
             <w:fldChar w:fldCharType="separate"/>
           </w:r>
@@ -761,7 +770,6 @@
               <w:rFonts w:asciiTheme="minorHAnsi" w:eastAsiaTheme="minorEastAsia" w:hAnsiTheme="minorHAnsi" w:cstheme="minorBidi"/>
               <w:noProof/>
               <w:kern w:val="2"/>
-              <w:lang w:val="ru-RU"/>
             </w:rPr>
           </w:pPr>
           <w:hyperlink w:anchor="_Toc230714471" w:history="1">
@@ -779,7 +787,6 @@
                 <w:rFonts w:asciiTheme="minorHAnsi" w:eastAsiaTheme="minorEastAsia" w:hAnsiTheme="minorHAnsi" w:cstheme="minorBidi"/>
                 <w:noProof/>
                 <w:kern w:val="2"/>
-                <w:lang w:val="ru-RU"/>
               </w:rPr>
               <w:tab/>
             </w:r>
@@ -849,7 +856,6 @@
               <w:rFonts w:asciiTheme="minorHAnsi" w:eastAsiaTheme="minorEastAsia" w:hAnsiTheme="minorHAnsi" w:cstheme="minorBidi"/>
               <w:noProof/>
               <w:kern w:val="2"/>
-              <w:lang w:val="ru-RU"/>
             </w:rPr>
           </w:pPr>
           <w:hyperlink w:anchor="_Toc230714472" w:history="1">
@@ -867,7 +873,6 @@
                 <w:rFonts w:asciiTheme="minorHAnsi" w:eastAsiaTheme="minorEastAsia" w:hAnsiTheme="minorHAnsi" w:cstheme="minorBidi"/>
                 <w:noProof/>
                 <w:kern w:val="2"/>
-                <w:lang w:val="ru-RU"/>
               </w:rPr>
               <w:tab/>
             </w:r>
@@ -937,7 +942,6 @@
               <w:rFonts w:asciiTheme="minorHAnsi" w:eastAsiaTheme="minorEastAsia" w:hAnsiTheme="minorHAnsi" w:cstheme="minorBidi"/>
               <w:noProof/>
               <w:kern w:val="2"/>
-              <w:lang w:val="ru-RU"/>
             </w:rPr>
           </w:pPr>
           <w:hyperlink w:anchor="_Toc230714473" w:history="1">
@@ -955,7 +959,6 @@
                 <w:rFonts w:asciiTheme="minorHAnsi" w:eastAsiaTheme="minorEastAsia" w:hAnsiTheme="minorHAnsi" w:cstheme="minorBidi"/>
                 <w:noProof/>
                 <w:kern w:val="2"/>
-                <w:lang w:val="ru-RU"/>
               </w:rPr>
               <w:tab/>
             </w:r>
@@ -1025,7 +1028,6 @@
               <w:rFonts w:asciiTheme="minorHAnsi" w:eastAsiaTheme="minorEastAsia" w:hAnsiTheme="minorHAnsi" w:cstheme="minorBidi"/>
               <w:noProof/>
               <w:kern w:val="2"/>
-              <w:lang w:val="ru-RU"/>
             </w:rPr>
           </w:pPr>
           <w:hyperlink w:anchor="_Toc230714474" w:history="1">
@@ -1043,7 +1045,6 @@
                 <w:rFonts w:asciiTheme="minorHAnsi" w:eastAsiaTheme="minorEastAsia" w:hAnsiTheme="minorHAnsi" w:cstheme="minorBidi"/>
                 <w:noProof/>
                 <w:kern w:val="2"/>
-                <w:lang w:val="ru-RU"/>
               </w:rPr>
               <w:tab/>
             </w:r>
@@ -1113,7 +1114,6 @@
               <w:rFonts w:asciiTheme="minorHAnsi" w:eastAsiaTheme="minorEastAsia" w:hAnsiTheme="minorHAnsi" w:cstheme="minorBidi"/>
               <w:noProof/>
               <w:kern w:val="2"/>
-              <w:lang w:val="ru-RU"/>
             </w:rPr>
           </w:pPr>
           <w:hyperlink w:anchor="_Toc230714475" w:history="1">
@@ -1131,7 +1131,6 @@
                 <w:rFonts w:asciiTheme="minorHAnsi" w:eastAsiaTheme="minorEastAsia" w:hAnsiTheme="minorHAnsi" w:cstheme="minorBidi"/>
                 <w:noProof/>
                 <w:kern w:val="2"/>
-                <w:lang w:val="ru-RU"/>
               </w:rPr>
               <w:tab/>
             </w:r>
@@ -1201,7 +1200,6 @@
               <w:rFonts w:asciiTheme="minorHAnsi" w:eastAsiaTheme="minorEastAsia" w:hAnsiTheme="minorHAnsi" w:cstheme="minorBidi"/>
               <w:noProof/>
               <w:kern w:val="2"/>
-              <w:lang w:val="ru-RU"/>
             </w:rPr>
           </w:pPr>
           <w:hyperlink w:anchor="_Toc230714476" w:history="1">
@@ -1219,7 +1217,6 @@
                 <w:rFonts w:asciiTheme="minorHAnsi" w:eastAsiaTheme="minorEastAsia" w:hAnsiTheme="minorHAnsi" w:cstheme="minorBidi"/>
                 <w:noProof/>
                 <w:kern w:val="2"/>
-                <w:lang w:val="ru-RU"/>
               </w:rPr>
               <w:tab/>
             </w:r>
@@ -1289,7 +1286,6 @@
               <w:rFonts w:asciiTheme="minorHAnsi" w:eastAsiaTheme="minorEastAsia" w:hAnsiTheme="minorHAnsi" w:cstheme="minorBidi"/>
               <w:noProof/>
               <w:kern w:val="2"/>
-              <w:lang w:val="ru-RU"/>
             </w:rPr>
           </w:pPr>
           <w:hyperlink w:anchor="_Toc230714477" w:history="1">
@@ -1307,7 +1303,6 @@
                 <w:rFonts w:asciiTheme="minorHAnsi" w:eastAsiaTheme="minorEastAsia" w:hAnsiTheme="minorHAnsi" w:cstheme="minorBidi"/>
                 <w:noProof/>
                 <w:kern w:val="2"/>
-                <w:lang w:val="ru-RU"/>
               </w:rPr>
               <w:tab/>
             </w:r>
@@ -1377,7 +1372,6 @@
               <w:rFonts w:asciiTheme="minorHAnsi" w:eastAsiaTheme="minorEastAsia" w:hAnsiTheme="minorHAnsi" w:cstheme="minorBidi"/>
               <w:noProof/>
               <w:kern w:val="2"/>
-              <w:lang w:val="ru-RU"/>
             </w:rPr>
           </w:pPr>
           <w:hyperlink w:anchor="_Toc230714478" w:history="1">
@@ -1395,7 +1389,6 @@
                 <w:rFonts w:asciiTheme="minorHAnsi" w:eastAsiaTheme="minorEastAsia" w:hAnsiTheme="minorHAnsi" w:cstheme="minorBidi"/>
                 <w:noProof/>
                 <w:kern w:val="2"/>
-                <w:lang w:val="ru-RU"/>
               </w:rPr>
               <w:tab/>
             </w:r>
@@ -1465,7 +1458,6 @@
               <w:rFonts w:asciiTheme="minorHAnsi" w:eastAsiaTheme="minorEastAsia" w:hAnsiTheme="minorHAnsi" w:cstheme="minorBidi"/>
               <w:noProof/>
               <w:kern w:val="2"/>
-              <w:lang w:val="ru-RU"/>
             </w:rPr>
           </w:pPr>
           <w:hyperlink w:anchor="_Toc230714479" w:history="1">
@@ -1483,7 +1475,6 @@
                 <w:rFonts w:asciiTheme="minorHAnsi" w:eastAsiaTheme="minorEastAsia" w:hAnsiTheme="minorHAnsi" w:cstheme="minorBidi"/>
                 <w:noProof/>
                 <w:kern w:val="2"/>
-                <w:lang w:val="ru-RU"/>
               </w:rPr>
               <w:tab/>
             </w:r>
@@ -1553,7 +1544,6 @@
               <w:rFonts w:asciiTheme="minorHAnsi" w:eastAsiaTheme="minorEastAsia" w:hAnsiTheme="minorHAnsi" w:cstheme="minorBidi"/>
               <w:noProof/>
               <w:kern w:val="2"/>
-              <w:lang w:val="ru-RU"/>
             </w:rPr>
           </w:pPr>
           <w:hyperlink w:anchor="_Toc230714480" w:history="1">
@@ -1571,7 +1561,6 @@
                 <w:rFonts w:asciiTheme="minorHAnsi" w:eastAsiaTheme="minorEastAsia" w:hAnsiTheme="minorHAnsi" w:cstheme="minorBidi"/>
                 <w:noProof/>
                 <w:kern w:val="2"/>
-                <w:lang w:val="ru-RU"/>
               </w:rPr>
               <w:tab/>
             </w:r>
@@ -1641,7 +1630,6 @@
               <w:rFonts w:asciiTheme="minorHAnsi" w:eastAsiaTheme="minorEastAsia" w:hAnsiTheme="minorHAnsi" w:cstheme="minorBidi"/>
               <w:noProof/>
               <w:kern w:val="2"/>
-              <w:lang w:val="ru-RU"/>
             </w:rPr>
           </w:pPr>
           <w:hyperlink w:anchor="_Toc230714481" w:history="1">
@@ -1659,7 +1647,6 @@
                 <w:rFonts w:asciiTheme="minorHAnsi" w:eastAsiaTheme="minorEastAsia" w:hAnsiTheme="minorHAnsi" w:cstheme="minorBidi"/>
                 <w:noProof/>
                 <w:kern w:val="2"/>
-                <w:lang w:val="ru-RU"/>
               </w:rPr>
               <w:tab/>
             </w:r>
@@ -1729,7 +1716,6 @@
               <w:rFonts w:asciiTheme="minorHAnsi" w:eastAsiaTheme="minorEastAsia" w:hAnsiTheme="minorHAnsi" w:cstheme="minorBidi"/>
               <w:noProof/>
               <w:kern w:val="2"/>
-              <w:lang w:val="ru-RU"/>
             </w:rPr>
           </w:pPr>
           <w:hyperlink w:anchor="_Toc230714482" w:history="1">
@@ -1739,7 +1725,6 @@
                 <w:b/>
                 <w:bCs/>
                 <w:noProof/>
-                <w:lang w:val="ru-RU"/>
               </w:rPr>
               <w:t>3.3.2</w:t>
             </w:r>
@@ -1748,7 +1733,6 @@
                 <w:rFonts w:asciiTheme="minorHAnsi" w:eastAsiaTheme="minorEastAsia" w:hAnsiTheme="minorHAnsi" w:cstheme="minorBidi"/>
                 <w:noProof/>
                 <w:kern w:val="2"/>
-                <w:lang w:val="ru-RU"/>
               </w:rPr>
               <w:tab/>
             </w:r>
@@ -1818,7 +1802,6 @@
               <w:rFonts w:asciiTheme="minorHAnsi" w:eastAsiaTheme="minorEastAsia" w:hAnsiTheme="minorHAnsi" w:cstheme="minorBidi"/>
               <w:noProof/>
               <w:kern w:val="2"/>
-              <w:lang w:val="ru-RU"/>
             </w:rPr>
           </w:pPr>
           <w:hyperlink w:anchor="_Toc230714483" w:history="1">
@@ -1836,7 +1819,6 @@
                 <w:rFonts w:asciiTheme="minorHAnsi" w:eastAsiaTheme="minorEastAsia" w:hAnsiTheme="minorHAnsi" w:cstheme="minorBidi"/>
                 <w:noProof/>
                 <w:kern w:val="2"/>
-                <w:lang w:val="ru-RU"/>
               </w:rPr>
               <w:tab/>
             </w:r>
@@ -1906,7 +1888,6 @@
               <w:rFonts w:asciiTheme="minorHAnsi" w:eastAsiaTheme="minorEastAsia" w:hAnsiTheme="minorHAnsi" w:cstheme="minorBidi"/>
               <w:noProof/>
               <w:kern w:val="2"/>
-              <w:lang w:val="ru-RU"/>
             </w:rPr>
           </w:pPr>
           <w:hyperlink w:anchor="_Toc230714484" w:history="1">
@@ -1924,7 +1905,6 @@
                 <w:rFonts w:asciiTheme="minorHAnsi" w:eastAsiaTheme="minorEastAsia" w:hAnsiTheme="minorHAnsi" w:cstheme="minorBidi"/>
                 <w:noProof/>
                 <w:kern w:val="2"/>
-                <w:lang w:val="ru-RU"/>
               </w:rPr>
               <w:tab/>
             </w:r>
@@ -1994,7 +1974,6 @@
               <w:rFonts w:asciiTheme="minorHAnsi" w:eastAsiaTheme="minorEastAsia" w:hAnsiTheme="minorHAnsi" w:cstheme="minorBidi"/>
               <w:noProof/>
               <w:kern w:val="2"/>
-              <w:lang w:val="ru-RU"/>
             </w:rPr>
           </w:pPr>
           <w:hyperlink w:anchor="_Toc230714485" w:history="1">
@@ -2012,7 +1991,6 @@
                 <w:rFonts w:asciiTheme="minorHAnsi" w:eastAsiaTheme="minorEastAsia" w:hAnsiTheme="minorHAnsi" w:cstheme="minorBidi"/>
                 <w:noProof/>
                 <w:kern w:val="2"/>
-                <w:lang w:val="ru-RU"/>
               </w:rPr>
               <w:tab/>
             </w:r>
@@ -2082,7 +2060,6 @@
               <w:rFonts w:asciiTheme="minorHAnsi" w:eastAsiaTheme="minorEastAsia" w:hAnsiTheme="minorHAnsi" w:cstheme="minorBidi"/>
               <w:noProof/>
               <w:kern w:val="2"/>
-              <w:lang w:val="ru-RU"/>
             </w:rPr>
           </w:pPr>
           <w:hyperlink w:anchor="_Toc230714486" w:history="1">
@@ -2100,7 +2077,6 @@
                 <w:rFonts w:asciiTheme="minorHAnsi" w:eastAsiaTheme="minorEastAsia" w:hAnsiTheme="minorHAnsi" w:cstheme="minorBidi"/>
                 <w:noProof/>
                 <w:kern w:val="2"/>
-                <w:lang w:val="ru-RU"/>
               </w:rPr>
               <w:tab/>
             </w:r>
@@ -2170,7 +2146,6 @@
               <w:rFonts w:asciiTheme="minorHAnsi" w:eastAsiaTheme="minorEastAsia" w:hAnsiTheme="minorHAnsi" w:cstheme="minorBidi"/>
               <w:noProof/>
               <w:kern w:val="2"/>
-              <w:lang w:val="ru-RU"/>
             </w:rPr>
           </w:pPr>
           <w:hyperlink w:anchor="_Toc230714487" w:history="1">
@@ -2188,7 +2163,6 @@
                 <w:rFonts w:asciiTheme="minorHAnsi" w:eastAsiaTheme="minorEastAsia" w:hAnsiTheme="minorHAnsi" w:cstheme="minorBidi"/>
                 <w:noProof/>
                 <w:kern w:val="2"/>
-                <w:lang w:val="ru-RU"/>
               </w:rPr>
               <w:tab/>
             </w:r>
@@ -2258,7 +2232,6 @@
               <w:rFonts w:asciiTheme="minorHAnsi" w:eastAsiaTheme="minorEastAsia" w:hAnsiTheme="minorHAnsi" w:cstheme="minorBidi"/>
               <w:noProof/>
               <w:kern w:val="2"/>
-              <w:lang w:val="ru-RU"/>
             </w:rPr>
           </w:pPr>
           <w:hyperlink w:anchor="_Toc230714488" w:history="1">
@@ -2276,7 +2249,6 @@
                 <w:rFonts w:asciiTheme="minorHAnsi" w:eastAsiaTheme="minorEastAsia" w:hAnsiTheme="minorHAnsi" w:cstheme="minorBidi"/>
                 <w:noProof/>
                 <w:kern w:val="2"/>
-                <w:lang w:val="ru-RU"/>
               </w:rPr>
               <w:tab/>
             </w:r>
@@ -2346,7 +2318,6 @@
               <w:rFonts w:asciiTheme="minorHAnsi" w:eastAsiaTheme="minorEastAsia" w:hAnsiTheme="minorHAnsi" w:cstheme="minorBidi"/>
               <w:noProof/>
               <w:kern w:val="2"/>
-              <w:lang w:val="ru-RU"/>
             </w:rPr>
           </w:pPr>
           <w:hyperlink w:anchor="_Toc230714489" w:history="1">
@@ -2364,7 +2335,6 @@
                 <w:rFonts w:asciiTheme="minorHAnsi" w:eastAsiaTheme="minorEastAsia" w:hAnsiTheme="minorHAnsi" w:cstheme="minorBidi"/>
                 <w:noProof/>
                 <w:kern w:val="2"/>
-                <w:lang w:val="ru-RU"/>
               </w:rPr>
               <w:tab/>
             </w:r>
@@ -2434,7 +2404,6 @@
               <w:rFonts w:asciiTheme="minorHAnsi" w:eastAsiaTheme="minorEastAsia" w:hAnsiTheme="minorHAnsi" w:cstheme="minorBidi"/>
               <w:noProof/>
               <w:kern w:val="2"/>
-              <w:lang w:val="ru-RU"/>
             </w:rPr>
           </w:pPr>
           <w:hyperlink w:anchor="_Toc230714490" w:history="1">
@@ -2452,7 +2421,6 @@
                 <w:rFonts w:asciiTheme="minorHAnsi" w:eastAsiaTheme="minorEastAsia" w:hAnsiTheme="minorHAnsi" w:cstheme="minorBidi"/>
                 <w:noProof/>
                 <w:kern w:val="2"/>
-                <w:lang w:val="ru-RU"/>
               </w:rPr>
               <w:tab/>
             </w:r>
@@ -2522,7 +2490,6 @@
               <w:rFonts w:asciiTheme="minorHAnsi" w:eastAsiaTheme="minorEastAsia" w:hAnsiTheme="minorHAnsi" w:cstheme="minorBidi"/>
               <w:noProof/>
               <w:kern w:val="2"/>
-              <w:lang w:val="ru-RU"/>
             </w:rPr>
           </w:pPr>
           <w:hyperlink w:anchor="_Toc230714491" w:history="1">
@@ -2540,7 +2507,6 @@
                 <w:rFonts w:asciiTheme="minorHAnsi" w:eastAsiaTheme="minorEastAsia" w:hAnsiTheme="minorHAnsi" w:cstheme="minorBidi"/>
                 <w:noProof/>
                 <w:kern w:val="2"/>
-                <w:lang w:val="ru-RU"/>
               </w:rPr>
               <w:tab/>
             </w:r>
@@ -2610,7 +2576,6 @@
               <w:rFonts w:asciiTheme="minorHAnsi" w:eastAsiaTheme="minorEastAsia" w:hAnsiTheme="minorHAnsi" w:cstheme="minorBidi"/>
               <w:noProof/>
               <w:kern w:val="2"/>
-              <w:lang w:val="ru-RU"/>
             </w:rPr>
           </w:pPr>
           <w:hyperlink w:anchor="_Toc230714492" w:history="1">
@@ -2628,7 +2593,6 @@
                 <w:rFonts w:asciiTheme="minorHAnsi" w:eastAsiaTheme="minorEastAsia" w:hAnsiTheme="minorHAnsi" w:cstheme="minorBidi"/>
                 <w:noProof/>
                 <w:kern w:val="2"/>
-                <w:lang w:val="ru-RU"/>
               </w:rPr>
               <w:tab/>
             </w:r>
@@ -2698,7 +2662,6 @@
               <w:rFonts w:asciiTheme="minorHAnsi" w:eastAsiaTheme="minorEastAsia" w:hAnsiTheme="minorHAnsi" w:cstheme="minorBidi"/>
               <w:noProof/>
               <w:kern w:val="2"/>
-              <w:lang w:val="ru-RU"/>
             </w:rPr>
           </w:pPr>
           <w:hyperlink w:anchor="_Toc230714493" w:history="1">
@@ -2716,7 +2679,6 @@
                 <w:rFonts w:asciiTheme="minorHAnsi" w:eastAsiaTheme="minorEastAsia" w:hAnsiTheme="minorHAnsi" w:cstheme="minorBidi"/>
                 <w:noProof/>
                 <w:kern w:val="2"/>
-                <w:lang w:val="ru-RU"/>
               </w:rPr>
               <w:tab/>
             </w:r>
@@ -2786,7 +2748,6 @@
               <w:rFonts w:asciiTheme="minorHAnsi" w:eastAsiaTheme="minorEastAsia" w:hAnsiTheme="minorHAnsi" w:cstheme="minorBidi"/>
               <w:noProof/>
               <w:kern w:val="2"/>
-              <w:lang w:val="ru-RU"/>
             </w:rPr>
           </w:pPr>
           <w:hyperlink w:anchor="_Toc230714494" w:history="1">
@@ -2804,7 +2765,6 @@
                 <w:rFonts w:asciiTheme="minorHAnsi" w:eastAsiaTheme="minorEastAsia" w:hAnsiTheme="minorHAnsi" w:cstheme="minorBidi"/>
                 <w:noProof/>
                 <w:kern w:val="2"/>
-                <w:lang w:val="ru-RU"/>
               </w:rPr>
               <w:tab/>
             </w:r>
@@ -2874,7 +2834,6 @@
               <w:rFonts w:asciiTheme="minorHAnsi" w:eastAsiaTheme="minorEastAsia" w:hAnsiTheme="minorHAnsi" w:cstheme="minorBidi"/>
               <w:noProof/>
               <w:kern w:val="2"/>
-              <w:lang w:val="ru-RU"/>
             </w:rPr>
           </w:pPr>
           <w:hyperlink w:anchor="_Toc230714495" w:history="1">
@@ -2884,7 +2843,6 @@
                 <w:b/>
                 <w:bCs/>
                 <w:noProof/>
-                <w:lang w:val="ru-RU"/>
               </w:rPr>
               <w:t>6</w:t>
             </w:r>
@@ -2893,7 +2851,6 @@
                 <w:rFonts w:asciiTheme="minorHAnsi" w:eastAsiaTheme="minorEastAsia" w:hAnsiTheme="minorHAnsi" w:cstheme="minorBidi"/>
                 <w:noProof/>
                 <w:kern w:val="2"/>
-                <w:lang w:val="ru-RU"/>
               </w:rPr>
               <w:tab/>
             </w:r>
@@ -2963,7 +2920,6 @@
               <w:rFonts w:asciiTheme="minorHAnsi" w:eastAsiaTheme="minorEastAsia" w:hAnsiTheme="minorHAnsi" w:cstheme="minorBidi"/>
               <w:noProof/>
               <w:kern w:val="2"/>
-              <w:lang w:val="ru-RU"/>
             </w:rPr>
           </w:pPr>
           <w:hyperlink w:anchor="_Toc230714496" w:history="1">
@@ -2973,7 +2929,6 @@
                 <w:b/>
                 <w:bCs/>
                 <w:noProof/>
-                <w:lang w:val="ru-RU"/>
               </w:rPr>
               <w:t>6.1</w:t>
             </w:r>
@@ -2982,7 +2937,6 @@
                 <w:rFonts w:asciiTheme="minorHAnsi" w:eastAsiaTheme="minorEastAsia" w:hAnsiTheme="minorHAnsi" w:cstheme="minorBidi"/>
                 <w:noProof/>
                 <w:kern w:val="2"/>
-                <w:lang w:val="ru-RU"/>
               </w:rPr>
               <w:tab/>
             </w:r>
@@ -3052,7 +3006,6 @@
               <w:rFonts w:asciiTheme="minorHAnsi" w:eastAsiaTheme="minorEastAsia" w:hAnsiTheme="minorHAnsi" w:cstheme="minorBidi"/>
               <w:noProof/>
               <w:kern w:val="2"/>
-              <w:lang w:val="ru-RU"/>
             </w:rPr>
           </w:pPr>
           <w:hyperlink w:anchor="_Toc230714497" w:history="1">
@@ -3062,7 +3015,6 @@
                 <w:b/>
                 <w:bCs/>
                 <w:noProof/>
-                <w:lang w:val="ru-RU"/>
               </w:rPr>
               <w:t>6.2</w:t>
             </w:r>
@@ -3071,7 +3023,6 @@
                 <w:rFonts w:asciiTheme="minorHAnsi" w:eastAsiaTheme="minorEastAsia" w:hAnsiTheme="minorHAnsi" w:cstheme="minorBidi"/>
                 <w:noProof/>
                 <w:kern w:val="2"/>
-                <w:lang w:val="ru-RU"/>
               </w:rPr>
               <w:tab/>
             </w:r>
@@ -3142,7 +3093,6 @@
           <w:r>
             <w:rPr>
               <w:noProof/>
-              <w:lang w:val="ru-RU"/>
             </w:rPr>
             <w:fldChar w:fldCharType="end"/>
           </w:r>
@@ -3156,15 +3106,13 @@
           <w:color w:val="000000"/>
           <w:sz w:val="28"/>
           <w:szCs w:val="28"/>
-          <w:lang w:val="ru-RU"/>
-        </w:rPr>
-      </w:pPr>
-      <w:r>
-        <w:rPr>
-          <w:color w:val="000000"/>
-          <w:sz w:val="28"/>
-          <w:szCs w:val="28"/>
-          <w:lang w:val="ru-RU"/>
+        </w:rPr>
+      </w:pPr>
+      <w:r>
+        <w:rPr>
+          <w:color w:val="000000"/>
+          <w:sz w:val="28"/>
+          <w:szCs w:val="28"/>
         </w:rPr>
         <w:br w:type="page"/>
       </w:r>
@@ -3216,15 +3164,13 @@
           <w:color w:val="000000"/>
           <w:sz w:val="28"/>
           <w:szCs w:val="28"/>
-          <w:lang w:val="ru-RU"/>
-        </w:rPr>
-      </w:pPr>
-      <w:r>
-        <w:rPr>
-          <w:color w:val="000000"/>
-          <w:sz w:val="28"/>
-          <w:szCs w:val="28"/>
-          <w:lang w:val="ru-RU"/>
+        </w:rPr>
+      </w:pPr>
+      <w:r>
+        <w:rPr>
+          <w:color w:val="000000"/>
+          <w:sz w:val="28"/>
+          <w:szCs w:val="28"/>
         </w:rPr>
         <w:t>В наши дни цифровизация повседневной жизни охватывает все больше сфер, включая практики саморефлексии, планирования и ведения личных записей. Традиционные бумажные дневники постепенно уступают место мобильным и десктопным приложениям, которые предлагают более удобные инструменты для организации мыслей, отслеживания настроения и сохранения воспоминаний.</w:t>
       </w:r>
@@ -3245,15 +3191,13 @@
           <w:color w:val="000000"/>
           <w:sz w:val="28"/>
           <w:szCs w:val="28"/>
-          <w:lang w:val="ru-RU"/>
-        </w:rPr>
-      </w:pPr>
-      <w:r>
-        <w:rPr>
-          <w:color w:val="000000"/>
-          <w:sz w:val="28"/>
-          <w:szCs w:val="28"/>
-          <w:lang w:val="ru-RU"/>
+        </w:rPr>
+      </w:pPr>
+      <w:r>
+        <w:rPr>
+          <w:color w:val="000000"/>
+          <w:sz w:val="28"/>
+          <w:szCs w:val="28"/>
         </w:rPr>
         <w:t>Однако вместе с ростом популярности цифровых дневников повышаются и требования пользователей к конфиденциальности, автономности и визуальной персонализации программного обеспечения.</w:t>
       </w:r>
@@ -3274,15 +3218,13 @@
           <w:color w:val="000000"/>
           <w:sz w:val="28"/>
           <w:szCs w:val="28"/>
-          <w:lang w:val="ru-RU"/>
-        </w:rPr>
-      </w:pPr>
-      <w:r>
-        <w:rPr>
-          <w:color w:val="000000"/>
-          <w:sz w:val="28"/>
-          <w:szCs w:val="28"/>
-          <w:lang w:val="ru-RU"/>
+        </w:rPr>
+      </w:pPr>
+      <w:r>
+        <w:rPr>
+          <w:color w:val="000000"/>
+          <w:sz w:val="28"/>
+          <w:szCs w:val="28"/>
         </w:rPr>
         <w:t>В первую очередь, использование большинства современных решений сопряжено с необходимостью обязательной регистрации, привязки к облачным сервисам и постоянного подключения к сети Интернет. Это не только усложняет пользовательский опыт, но и создает потенциальные риски утечки личной информации на удаленные сервера, что критично для приложений подобного класса.</w:t>
       </w:r>
@@ -3303,15 +3245,13 @@
           <w:color w:val="000000"/>
           <w:sz w:val="28"/>
           <w:szCs w:val="28"/>
-          <w:lang w:val="ru-RU"/>
-        </w:rPr>
-      </w:pPr>
-      <w:r>
-        <w:rPr>
-          <w:color w:val="000000"/>
-          <w:sz w:val="28"/>
-          <w:szCs w:val="28"/>
-          <w:lang w:val="ru-RU"/>
+        </w:rPr>
+      </w:pPr>
+      <w:r>
+        <w:rPr>
+          <w:color w:val="000000"/>
+          <w:sz w:val="28"/>
+          <w:szCs w:val="28"/>
         </w:rPr>
         <w:t>Кроме того, многие аналоги имеют жестко заданный, негибкий интерфейс. Отсутствие возможностей для персонализации среды и интерактивного взаимодействия лишает пользователя свободы самовыражения, делая процесс ведения ежедневных записей монотонным.</w:t>
       </w:r>
@@ -3332,15 +3272,13 @@
           <w:color w:val="000000"/>
           <w:sz w:val="28"/>
           <w:szCs w:val="28"/>
-          <w:lang w:val="ru-RU"/>
-        </w:rPr>
-      </w:pPr>
-      <w:r>
-        <w:rPr>
-          <w:color w:val="000000"/>
-          <w:sz w:val="28"/>
-          <w:szCs w:val="28"/>
-          <w:lang w:val="ru-RU"/>
+        </w:rPr>
+      </w:pPr>
+      <w:r>
+        <w:rPr>
+          <w:color w:val="000000"/>
+          <w:sz w:val="28"/>
+          <w:szCs w:val="28"/>
         </w:rPr>
         <w:t>Кроссплатформенное приложение «My Diary» позволяет решить описанные проблемы, предоставляя пользователям единое, полностью автономное и настраиваемое рабочее пространство для ведения личных дневников.</w:t>
       </w:r>
@@ -3361,15 +3299,13 @@
           <w:color w:val="000000"/>
           <w:sz w:val="28"/>
           <w:szCs w:val="28"/>
-          <w:lang w:val="ru-RU"/>
-        </w:rPr>
-      </w:pPr>
-      <w:r>
-        <w:rPr>
-          <w:color w:val="000000"/>
-          <w:sz w:val="28"/>
-          <w:szCs w:val="28"/>
-          <w:lang w:val="ru-RU"/>
+        </w:rPr>
+      </w:pPr>
+      <w:r>
+        <w:rPr>
+          <w:color w:val="000000"/>
+          <w:sz w:val="28"/>
+          <w:szCs w:val="28"/>
         </w:rPr>
         <w:t>Приложение объединяет в себе гибкий блочный редактор текста с возможностью встраивания локальных изображений и систему интерактивных стикеров, поддерживающих свободное позиционирование (Drag-and-Drop) поверх контента.</w:t>
       </w:r>
@@ -3390,15 +3326,13 @@
           <w:color w:val="000000"/>
           <w:sz w:val="28"/>
           <w:szCs w:val="28"/>
-          <w:lang w:val="ru-RU"/>
-        </w:rPr>
-      </w:pPr>
-      <w:r>
-        <w:rPr>
-          <w:color w:val="000000"/>
-          <w:sz w:val="28"/>
-          <w:szCs w:val="28"/>
-          <w:lang w:val="ru-RU"/>
+        </w:rPr>
+      </w:pPr>
+      <w:r>
+        <w:rPr>
+          <w:color w:val="000000"/>
+          <w:sz w:val="28"/>
+          <w:szCs w:val="28"/>
         </w:rPr>
         <w:lastRenderedPageBreak/>
         <w:t>Кроме того, программа берет на себя задачи по надежному локальному хранению данных на устройстве (без использования сторонних серверов), предлагает встроенную систему кастомизации с поддержкой различных цветовых схем (глубокая синяя, мятная зеленая, розовая сакура) и мультиязычность.</w:t>
@@ -3420,15 +3354,13 @@
           <w:color w:val="000000"/>
           <w:sz w:val="28"/>
           <w:szCs w:val="28"/>
-          <w:lang w:val="ru-RU"/>
-        </w:rPr>
-      </w:pPr>
-      <w:r>
-        <w:rPr>
-          <w:color w:val="000000"/>
-          <w:sz w:val="28"/>
-          <w:szCs w:val="28"/>
-          <w:lang w:val="ru-RU"/>
+        </w:rPr>
+      </w:pPr>
+      <w:r>
+        <w:rPr>
+          <w:color w:val="000000"/>
+          <w:sz w:val="28"/>
+          <w:szCs w:val="28"/>
         </w:rPr>
         <w:t xml:space="preserve">Это обеспечивает комфортную, интуитивно понятную и безопасную среду для ежедневного использования, снижает порог входа для новых пользователей и гарантирует полную независимость функционала от сетевой инфраструктуры, повышая общее качество </w:t>
       </w:r>
@@ -3449,7 +3381,6 @@
           <w:color w:val="000000"/>
           <w:sz w:val="28"/>
           <w:szCs w:val="28"/>
-          <w:lang w:val="ru-RU"/>
         </w:rPr>
       </w:pPr>
       <w:r>
@@ -3548,15 +3479,13 @@
           <w:color w:val="000000"/>
           <w:sz w:val="28"/>
           <w:szCs w:val="28"/>
-          <w:lang w:val="ru-RU"/>
-        </w:rPr>
-      </w:pPr>
-      <w:r>
-        <w:rPr>
-          <w:color w:val="000000"/>
-          <w:sz w:val="28"/>
-          <w:szCs w:val="28"/>
-          <w:lang w:val="ru-RU"/>
+        </w:rPr>
+      </w:pPr>
+      <w:r>
+        <w:rPr>
+          <w:color w:val="000000"/>
+          <w:sz w:val="28"/>
+          <w:szCs w:val="28"/>
         </w:rPr>
         <w:t>Приложения для ведения личных записей (электронные дневники) предназначены для фиксации повседневных мыслей, сохранения памятных моментов, а также отслеживания эмоционального состояния пользователя. Основной аудиторией таких программных продуктов являются люди, стремящиеся к структурированию своей жизни, саморефлексии и творческому оформлению заметок.</w:t>
       </w:r>
@@ -3577,15 +3506,13 @@
           <w:color w:val="000000"/>
           <w:sz w:val="28"/>
           <w:szCs w:val="28"/>
-          <w:lang w:val="ru-RU"/>
-        </w:rPr>
-      </w:pPr>
-      <w:r>
-        <w:rPr>
-          <w:color w:val="000000"/>
-          <w:sz w:val="28"/>
-          <w:szCs w:val="28"/>
-          <w:lang w:val="ru-RU"/>
+        </w:rPr>
+      </w:pPr>
+      <w:r>
+        <w:rPr>
+          <w:color w:val="000000"/>
+          <w:sz w:val="28"/>
+          <w:szCs w:val="28"/>
         </w:rPr>
         <w:t>Традиционно разработка подобного программного обеспечения требует реализации удобного текстового редактора, системы хранения файлов и интуитивно понятного интерфейса. Приложение «My Diary» объединяет этот функционал, позволяя пользователям создавать записи с использованием блочной структуры (сочетая текст и локальные изображения), а также оформлять их с помощью системы интерактивных стикеров, свободно перемещаемых по холсту экрана.</w:t>
       </w:r>
@@ -3606,15 +3533,13 @@
           <w:color w:val="000000"/>
           <w:sz w:val="28"/>
           <w:szCs w:val="28"/>
-          <w:lang w:val="ru-RU"/>
-        </w:rPr>
-      </w:pPr>
-      <w:r>
-        <w:rPr>
-          <w:color w:val="000000"/>
-          <w:sz w:val="28"/>
-          <w:szCs w:val="28"/>
-          <w:lang w:val="ru-RU"/>
+        </w:rPr>
+      </w:pPr>
+      <w:r>
+        <w:rPr>
+          <w:color w:val="000000"/>
+          <w:sz w:val="28"/>
+          <w:szCs w:val="28"/>
         </w:rPr>
         <w:t>Среди плюсов использования кроссплатформенного приложения «My Diary» можно отметить следующие:</w:t>
       </w:r>
@@ -3734,15 +3659,13 @@
           <w:color w:val="000000"/>
           <w:sz w:val="28"/>
           <w:szCs w:val="28"/>
-          <w:lang w:val="ru-RU"/>
-        </w:rPr>
-      </w:pPr>
-      <w:r>
-        <w:rPr>
-          <w:color w:val="000000"/>
-          <w:sz w:val="28"/>
-          <w:szCs w:val="28"/>
-          <w:lang w:val="ru-RU"/>
+        </w:rPr>
+      </w:pPr>
+      <w:r>
+        <w:rPr>
+          <w:color w:val="000000"/>
+          <w:sz w:val="28"/>
+          <w:szCs w:val="28"/>
         </w:rPr>
         <w:lastRenderedPageBreak/>
         <w:t>Для нормального функционирования приложения требуются следующие данные:</w:t>
@@ -3764,15 +3687,13 @@
           <w:color w:val="000000"/>
           <w:sz w:val="28"/>
           <w:szCs w:val="28"/>
-          <w:lang w:val="ru-RU"/>
-        </w:rPr>
-      </w:pPr>
-      <w:r>
-        <w:rPr>
-          <w:color w:val="000000"/>
-          <w:sz w:val="28"/>
-          <w:szCs w:val="28"/>
-          <w:lang w:val="ru-RU"/>
+        </w:rPr>
+      </w:pPr>
+      <w:r>
+        <w:rPr>
+          <w:color w:val="000000"/>
+          <w:sz w:val="28"/>
+          <w:szCs w:val="28"/>
         </w:rPr>
         <w:t>Входные данные:</w:t>
       </w:r>
@@ -3925,15 +3846,13 @@
           <w:color w:val="000000"/>
           <w:sz w:val="28"/>
           <w:szCs w:val="28"/>
-          <w:lang w:val="ru-RU"/>
-        </w:rPr>
-      </w:pPr>
-      <w:r>
-        <w:rPr>
-          <w:color w:val="000000"/>
-          <w:sz w:val="28"/>
-          <w:szCs w:val="28"/>
-          <w:lang w:val="ru-RU"/>
+        </w:rPr>
+      </w:pPr>
+      <w:r>
+        <w:rPr>
+          <w:color w:val="000000"/>
+          <w:sz w:val="28"/>
+          <w:szCs w:val="28"/>
         </w:rPr>
         <w:t>Выходные данные:</w:t>
       </w:r>
@@ -4011,15 +3930,13 @@
           <w:color w:val="000000"/>
           <w:sz w:val="28"/>
           <w:szCs w:val="28"/>
-          <w:lang w:val="ru-RU"/>
-        </w:rPr>
-      </w:pPr>
-      <w:r>
-        <w:rPr>
-          <w:color w:val="000000"/>
-          <w:sz w:val="28"/>
-          <w:szCs w:val="28"/>
-          <w:lang w:val="ru-RU"/>
+        </w:rPr>
+      </w:pPr>
+      <w:r>
+        <w:rPr>
+          <w:color w:val="000000"/>
+          <w:sz w:val="28"/>
+          <w:szCs w:val="28"/>
         </w:rPr>
         <w:br w:type="page"/>
       </w:r>
@@ -4077,15 +3994,13 @@
           <w:color w:val="000000"/>
           <w:sz w:val="28"/>
           <w:szCs w:val="28"/>
-          <w:lang w:val="ru-RU"/>
-        </w:rPr>
-      </w:pPr>
-      <w:r>
-        <w:rPr>
-          <w:color w:val="000000"/>
-          <w:sz w:val="28"/>
-          <w:szCs w:val="28"/>
-          <w:lang w:val="ru-RU"/>
+        </w:rPr>
+      </w:pPr>
+      <w:r>
+        <w:rPr>
+          <w:color w:val="000000"/>
+          <w:sz w:val="28"/>
+          <w:szCs w:val="28"/>
         </w:rPr>
         <w:t xml:space="preserve">Для разработки кроссплатформенного приложения можно использовать различные инструментальные средства, фреймворки и языки программирования. </w:t>
       </w:r>
@@ -4106,15 +4021,13 @@
           <w:color w:val="000000"/>
           <w:sz w:val="28"/>
           <w:szCs w:val="28"/>
-          <w:lang w:val="ru-RU"/>
-        </w:rPr>
-      </w:pPr>
-      <w:r>
-        <w:rPr>
-          <w:color w:val="000000"/>
-          <w:sz w:val="28"/>
-          <w:szCs w:val="28"/>
-          <w:lang w:val="ru-RU"/>
+        </w:rPr>
+      </w:pPr>
+      <w:r>
+        <w:rPr>
+          <w:color w:val="000000"/>
+          <w:sz w:val="28"/>
+          <w:szCs w:val="28"/>
         </w:rPr>
         <w:t>В таблице 1 представлено сравнение популярных фреймворков для кроссплатформенной разработки (мобильные и настольные ОС).</w:t>
       </w:r>
@@ -4135,15 +4048,13 @@
           <w:color w:val="000000"/>
           <w:sz w:val="28"/>
           <w:szCs w:val="28"/>
-          <w:lang w:val="ru-RU"/>
-        </w:rPr>
-      </w:pPr>
-      <w:r>
-        <w:rPr>
-          <w:color w:val="000000"/>
-          <w:sz w:val="28"/>
-          <w:szCs w:val="28"/>
-          <w:lang w:val="ru-RU"/>
+        </w:rPr>
+      </w:pPr>
+      <w:r>
+        <w:rPr>
+          <w:color w:val="000000"/>
+          <w:sz w:val="28"/>
+          <w:szCs w:val="28"/>
         </w:rPr>
         <w:t xml:space="preserve">Таблица </w:t>
       </w:r>
@@ -4152,7 +4063,6 @@
           <w:color w:val="000000"/>
           <w:sz w:val="28"/>
           <w:szCs w:val="28"/>
-          <w:lang w:val="ru-RU"/>
         </w:rPr>
         <w:t>1</w:t>
       </w:r>
@@ -4161,7 +4071,6 @@
           <w:color w:val="000000"/>
           <w:sz w:val="28"/>
           <w:szCs w:val="28"/>
-          <w:lang w:val="ru-RU"/>
         </w:rPr>
         <w:t xml:space="preserve"> — Сравнение </w:t>
       </w:r>
@@ -4170,7 +4079,6 @@
           <w:color w:val="000000"/>
           <w:sz w:val="28"/>
           <w:szCs w:val="28"/>
-          <w:lang w:val="ru-RU"/>
         </w:rPr>
         <w:t>фреймворков разработки</w:t>
       </w:r>
@@ -4321,14 +4229,12 @@
               <w:rPr>
                 <w:sz w:val="28"/>
                 <w:szCs w:val="28"/>
-                <w:lang w:val="ru-RU"/>
               </w:rPr>
             </w:pPr>
             <w:r>
               <w:rPr>
                 <w:sz w:val="28"/>
                 <w:szCs w:val="28"/>
-                <w:lang w:val="ru-RU"/>
               </w:rPr>
               <w:t>+</w:t>
             </w:r>
@@ -4344,14 +4250,12 @@
               <w:rPr>
                 <w:sz w:val="28"/>
                 <w:szCs w:val="28"/>
-                <w:lang w:val="ru-RU"/>
               </w:rPr>
             </w:pPr>
             <w:r>
               <w:rPr>
                 <w:sz w:val="28"/>
                 <w:szCs w:val="28"/>
-                <w:lang w:val="ru-RU"/>
               </w:rPr>
               <w:t>+</w:t>
             </w:r>
@@ -4367,14 +4271,12 @@
               <w:rPr>
                 <w:sz w:val="28"/>
                 <w:szCs w:val="28"/>
-                <w:lang w:val="ru-RU"/>
               </w:rPr>
             </w:pPr>
             <w:r>
               <w:rPr>
                 <w:sz w:val="28"/>
                 <w:szCs w:val="28"/>
-                <w:lang w:val="ru-RU"/>
               </w:rPr>
               <w:t>+</w:t>
             </w:r>
@@ -4413,14 +4315,12 @@
               <w:rPr>
                 <w:sz w:val="28"/>
                 <w:szCs w:val="28"/>
-                <w:lang w:val="ru-RU"/>
               </w:rPr>
             </w:pPr>
             <w:r>
               <w:rPr>
                 <w:sz w:val="28"/>
                 <w:szCs w:val="28"/>
-                <w:lang w:val="ru-RU"/>
               </w:rPr>
               <w:t>+</w:t>
             </w:r>
@@ -4436,14 +4336,12 @@
               <w:rPr>
                 <w:sz w:val="28"/>
                 <w:szCs w:val="28"/>
-                <w:lang w:val="ru-RU"/>
               </w:rPr>
             </w:pPr>
             <w:r>
               <w:rPr>
                 <w:sz w:val="28"/>
                 <w:szCs w:val="28"/>
-                <w:lang w:val="ru-RU"/>
               </w:rPr>
               <w:t>-</w:t>
             </w:r>
@@ -4459,14 +4357,12 @@
               <w:rPr>
                 <w:sz w:val="28"/>
                 <w:szCs w:val="28"/>
-                <w:lang w:val="ru-RU"/>
               </w:rPr>
             </w:pPr>
             <w:r>
               <w:rPr>
                 <w:sz w:val="28"/>
                 <w:szCs w:val="28"/>
-                <w:lang w:val="ru-RU"/>
               </w:rPr>
               <w:t>-</w:t>
             </w:r>
@@ -4526,14 +4422,12 @@
               <w:rPr>
                 <w:sz w:val="28"/>
                 <w:szCs w:val="28"/>
-                <w:lang w:val="ru-RU"/>
               </w:rPr>
             </w:pPr>
             <w:r>
               <w:rPr>
                 <w:sz w:val="28"/>
                 <w:szCs w:val="28"/>
-                <w:lang w:val="ru-RU"/>
               </w:rPr>
               <w:t>-</w:t>
             </w:r>
@@ -4549,14 +4443,12 @@
               <w:rPr>
                 <w:sz w:val="28"/>
                 <w:szCs w:val="28"/>
-                <w:lang w:val="ru-RU"/>
               </w:rPr>
             </w:pPr>
             <w:r>
               <w:rPr>
                 <w:sz w:val="28"/>
                 <w:szCs w:val="28"/>
-                <w:lang w:val="ru-RU"/>
               </w:rPr>
               <w:t>+</w:t>
             </w:r>
@@ -4595,14 +4487,12 @@
               <w:rPr>
                 <w:sz w:val="28"/>
                 <w:szCs w:val="28"/>
-                <w:lang w:val="ru-RU"/>
               </w:rPr>
             </w:pPr>
             <w:r>
               <w:rPr>
                 <w:sz w:val="28"/>
                 <w:szCs w:val="28"/>
-                <w:lang w:val="ru-RU"/>
               </w:rPr>
               <w:t>+</w:t>
             </w:r>
@@ -4618,14 +4508,12 @@
               <w:rPr>
                 <w:sz w:val="28"/>
                 <w:szCs w:val="28"/>
-                <w:lang w:val="ru-RU"/>
               </w:rPr>
             </w:pPr>
             <w:r>
               <w:rPr>
                 <w:sz w:val="28"/>
                 <w:szCs w:val="28"/>
-                <w:lang w:val="ru-RU"/>
               </w:rPr>
               <w:t>-</w:t>
             </w:r>
@@ -4641,14 +4529,12 @@
               <w:rPr>
                 <w:sz w:val="28"/>
                 <w:szCs w:val="28"/>
-                <w:lang w:val="ru-RU"/>
               </w:rPr>
             </w:pPr>
             <w:r>
               <w:rPr>
                 <w:sz w:val="28"/>
                 <w:szCs w:val="28"/>
-                <w:lang w:val="ru-RU"/>
               </w:rPr>
               <w:t>-</w:t>
             </w:r>
@@ -4672,15 +4558,13 @@
           <w:color w:val="000000"/>
           <w:sz w:val="28"/>
           <w:szCs w:val="28"/>
-          <w:lang w:val="ru-RU"/>
-        </w:rPr>
-      </w:pPr>
-      <w:r>
-        <w:rPr>
-          <w:color w:val="000000"/>
-          <w:sz w:val="28"/>
-          <w:szCs w:val="28"/>
-          <w:lang w:val="ru-RU"/>
+        </w:rPr>
+      </w:pPr>
+      <w:r>
+        <w:rPr>
+          <w:color w:val="000000"/>
+          <w:sz w:val="28"/>
+          <w:szCs w:val="28"/>
         </w:rPr>
         <w:t>Исходя из таблицы 1, для разработки клиентской части приложения был выбран фреймворк Flutter. Он предоставляет мощный движок рендеринга, который идеально подходит для реализации системы свободного позиционирования стикеров (через виджеты Positioned и обработку жестов onPanUpdate), а также обеспечивает идентичный внешний вид интерфейса как на смартфонах, так и на десктопных компьютерах.</w:t>
       </w:r>
@@ -4701,15 +4585,13 @@
           <w:color w:val="000000"/>
           <w:sz w:val="28"/>
           <w:szCs w:val="28"/>
-          <w:lang w:val="ru-RU"/>
-        </w:rPr>
-      </w:pPr>
-      <w:r>
-        <w:rPr>
-          <w:color w:val="000000"/>
-          <w:sz w:val="28"/>
-          <w:szCs w:val="28"/>
-          <w:lang w:val="ru-RU"/>
+        </w:rPr>
+      </w:pPr>
+      <w:r>
+        <w:rPr>
+          <w:color w:val="000000"/>
+          <w:sz w:val="28"/>
+          <w:szCs w:val="28"/>
         </w:rPr>
         <w:t>В таблице 2 представлено сравнение языков программирования, применяемых в выбранных технологиях.</w:t>
       </w:r>
@@ -4730,15 +4612,13 @@
           <w:color w:val="000000"/>
           <w:sz w:val="28"/>
           <w:szCs w:val="28"/>
-          <w:lang w:val="ru-RU"/>
-        </w:rPr>
-      </w:pPr>
-      <w:r>
-        <w:rPr>
-          <w:color w:val="000000"/>
-          <w:sz w:val="28"/>
-          <w:szCs w:val="28"/>
-          <w:lang w:val="ru-RU"/>
+        </w:rPr>
+      </w:pPr>
+      <w:r>
+        <w:rPr>
+          <w:color w:val="000000"/>
+          <w:sz w:val="28"/>
+          <w:szCs w:val="28"/>
         </w:rPr>
         <w:t xml:space="preserve">Таблица </w:t>
       </w:r>
@@ -4747,7 +4627,6 @@
           <w:color w:val="000000"/>
           <w:sz w:val="28"/>
           <w:szCs w:val="28"/>
-          <w:lang w:val="ru-RU"/>
         </w:rPr>
         <w:t>2</w:t>
       </w:r>
@@ -4756,7 +4635,6 @@
           <w:color w:val="000000"/>
           <w:sz w:val="28"/>
           <w:szCs w:val="28"/>
-          <w:lang w:val="ru-RU"/>
         </w:rPr>
         <w:t xml:space="preserve"> — </w:t>
       </w:r>
@@ -4765,7 +4643,6 @@
           <w:color w:val="000000"/>
           <w:sz w:val="28"/>
           <w:szCs w:val="28"/>
-          <w:lang w:val="ru-RU"/>
         </w:rPr>
         <w:t xml:space="preserve">Сравнение </w:t>
       </w:r>
@@ -4774,7 +4651,6 @@
           <w:color w:val="000000"/>
           <w:sz w:val="28"/>
           <w:szCs w:val="28"/>
-          <w:lang w:val="ru-RU"/>
         </w:rPr>
         <w:t>языков программирования</w:t>
       </w:r>
@@ -4814,7 +4690,6 @@
               <w:rPr>
                 <w:sz w:val="28"/>
                 <w:szCs w:val="28"/>
-                <w:lang w:val="ru-RU"/>
               </w:rPr>
             </w:pPr>
             <w:r>
@@ -4933,14 +4808,12 @@
               <w:rPr>
                 <w:sz w:val="28"/>
                 <w:szCs w:val="28"/>
-                <w:lang w:val="ru-RU"/>
               </w:rPr>
             </w:pPr>
             <w:r>
               <w:rPr>
                 <w:sz w:val="28"/>
                 <w:szCs w:val="28"/>
-                <w:lang w:val="ru-RU"/>
               </w:rPr>
               <w:t>+</w:t>
             </w:r>
@@ -4956,14 +4829,12 @@
               <w:rPr>
                 <w:sz w:val="28"/>
                 <w:szCs w:val="28"/>
-                <w:lang w:val="ru-RU"/>
               </w:rPr>
             </w:pPr>
             <w:r>
               <w:rPr>
                 <w:sz w:val="28"/>
                 <w:szCs w:val="28"/>
-                <w:lang w:val="ru-RU"/>
               </w:rPr>
               <w:t>-</w:t>
             </w:r>
@@ -4979,14 +4850,12 @@
               <w:rPr>
                 <w:sz w:val="28"/>
                 <w:szCs w:val="28"/>
-                <w:lang w:val="ru-RU"/>
               </w:rPr>
             </w:pPr>
             <w:r>
               <w:rPr>
                 <w:sz w:val="28"/>
                 <w:szCs w:val="28"/>
-                <w:lang w:val="ru-RU"/>
               </w:rPr>
               <w:t>-</w:t>
             </w:r>
@@ -5049,14 +4918,12 @@
               <w:rPr>
                 <w:sz w:val="28"/>
                 <w:szCs w:val="28"/>
-                <w:lang w:val="ru-RU"/>
               </w:rPr>
             </w:pPr>
             <w:r>
               <w:rPr>
                 <w:sz w:val="28"/>
                 <w:szCs w:val="28"/>
-                <w:lang w:val="ru-RU"/>
               </w:rPr>
               <w:t>-</w:t>
             </w:r>
@@ -5072,14 +4939,12 @@
               <w:rPr>
                 <w:sz w:val="28"/>
                 <w:szCs w:val="28"/>
-                <w:lang w:val="ru-RU"/>
               </w:rPr>
             </w:pPr>
             <w:r>
               <w:rPr>
                 <w:sz w:val="28"/>
                 <w:szCs w:val="28"/>
-                <w:lang w:val="ru-RU"/>
               </w:rPr>
               <w:t>+</w:t>
             </w:r>
@@ -5142,14 +5007,12 @@
               <w:rPr>
                 <w:sz w:val="28"/>
                 <w:szCs w:val="28"/>
-                <w:lang w:val="ru-RU"/>
               </w:rPr>
             </w:pPr>
             <w:r>
               <w:rPr>
                 <w:sz w:val="28"/>
                 <w:szCs w:val="28"/>
-                <w:lang w:val="ru-RU"/>
               </w:rPr>
               <w:t>-</w:t>
             </w:r>
@@ -5165,14 +5028,12 @@
               <w:rPr>
                 <w:sz w:val="28"/>
                 <w:szCs w:val="28"/>
-                <w:lang w:val="ru-RU"/>
               </w:rPr>
             </w:pPr>
             <w:r>
               <w:rPr>
                 <w:sz w:val="28"/>
                 <w:szCs w:val="28"/>
-                <w:lang w:val="ru-RU"/>
               </w:rPr>
               <w:t>+</w:t>
             </w:r>
@@ -5214,14 +5075,12 @@
               <w:rPr>
                 <w:sz w:val="28"/>
                 <w:szCs w:val="28"/>
-                <w:lang w:val="ru-RU"/>
               </w:rPr>
             </w:pPr>
             <w:r>
               <w:rPr>
                 <w:sz w:val="28"/>
                 <w:szCs w:val="28"/>
-                <w:lang w:val="ru-RU"/>
               </w:rPr>
               <w:t>+</w:t>
             </w:r>
@@ -5237,14 +5096,12 @@
               <w:rPr>
                 <w:sz w:val="28"/>
                 <w:szCs w:val="28"/>
-                <w:lang w:val="ru-RU"/>
               </w:rPr>
             </w:pPr>
             <w:r>
               <w:rPr>
                 <w:sz w:val="28"/>
                 <w:szCs w:val="28"/>
-                <w:lang w:val="ru-RU"/>
               </w:rPr>
               <w:t>+</w:t>
             </w:r>
@@ -5260,14 +5117,12 @@
               <w:rPr>
                 <w:sz w:val="28"/>
                 <w:szCs w:val="28"/>
-                <w:lang w:val="ru-RU"/>
               </w:rPr>
             </w:pPr>
             <w:r>
               <w:rPr>
                 <w:sz w:val="28"/>
                 <w:szCs w:val="28"/>
-                <w:lang w:val="ru-RU"/>
               </w:rPr>
               <w:t>-</w:t>
             </w:r>
@@ -5291,15 +5146,13 @@
           <w:color w:val="000000"/>
           <w:sz w:val="28"/>
           <w:szCs w:val="28"/>
-          <w:lang w:val="ru-RU"/>
-        </w:rPr>
-      </w:pPr>
-      <w:r>
-        <w:rPr>
-          <w:color w:val="000000"/>
-          <w:sz w:val="28"/>
-          <w:szCs w:val="28"/>
-          <w:lang w:val="ru-RU"/>
+        </w:rPr>
+      </w:pPr>
+      <w:r>
+        <w:rPr>
+          <w:color w:val="000000"/>
+          <w:sz w:val="28"/>
+          <w:szCs w:val="28"/>
         </w:rPr>
         <w:t>Исходя из таблицы 2, в связке с фреймворком Flutter был выбран язык программирования Dart.</w:t>
       </w:r>
@@ -5320,15 +5173,13 @@
           <w:color w:val="000000"/>
           <w:sz w:val="28"/>
           <w:szCs w:val="28"/>
-          <w:lang w:val="ru-RU"/>
-        </w:rPr>
-      </w:pPr>
-      <w:r>
-        <w:rPr>
-          <w:color w:val="000000"/>
-          <w:sz w:val="28"/>
-          <w:szCs w:val="28"/>
-          <w:lang w:val="ru-RU"/>
+        </w:rPr>
+      </w:pPr>
+      <w:r>
+        <w:rPr>
+          <w:color w:val="000000"/>
+          <w:sz w:val="28"/>
+          <w:szCs w:val="28"/>
         </w:rPr>
         <w:t>Так как приложению требуется легковесное локальное хранение данных без необходимости развертывания сложных реляционных структур, в таблице 3 представлено сравнение систем хранения данных для мобильных и десктопных устройств.</w:t>
       </w:r>
@@ -5349,15 +5200,13 @@
           <w:color w:val="000000"/>
           <w:sz w:val="28"/>
           <w:szCs w:val="28"/>
-          <w:lang w:val="ru-RU"/>
-        </w:rPr>
-      </w:pPr>
-      <w:r>
-        <w:rPr>
-          <w:color w:val="000000"/>
-          <w:sz w:val="28"/>
-          <w:szCs w:val="28"/>
-          <w:lang w:val="ru-RU"/>
+        </w:rPr>
+      </w:pPr>
+      <w:r>
+        <w:rPr>
+          <w:color w:val="000000"/>
+          <w:sz w:val="28"/>
+          <w:szCs w:val="28"/>
         </w:rPr>
         <w:t xml:space="preserve">Таблица </w:t>
       </w:r>
@@ -5366,7 +5215,6 @@
           <w:color w:val="000000"/>
           <w:sz w:val="28"/>
           <w:szCs w:val="28"/>
-          <w:lang w:val="ru-RU"/>
         </w:rPr>
         <w:t>3</w:t>
       </w:r>
@@ -5375,7 +5223,6 @@
           <w:color w:val="000000"/>
           <w:sz w:val="28"/>
           <w:szCs w:val="28"/>
-          <w:lang w:val="ru-RU"/>
         </w:rPr>
         <w:t xml:space="preserve"> — Сравнение </w:t>
       </w:r>
@@ -5548,7 +5395,6 @@
               <w:rPr>
                 <w:sz w:val="28"/>
                 <w:szCs w:val="28"/>
-                <w:lang w:val="ru-RU"/>
               </w:rPr>
             </w:pPr>
             <w:r>
@@ -5570,7 +5416,6 @@
               <w:rPr>
                 <w:sz w:val="28"/>
                 <w:szCs w:val="28"/>
-                <w:lang w:val="ru-RU"/>
               </w:rPr>
             </w:pPr>
             <w:r>
@@ -5636,14 +5481,12 @@
               <w:rPr>
                 <w:sz w:val="28"/>
                 <w:szCs w:val="28"/>
-                <w:lang w:val="ru-RU"/>
               </w:rPr>
             </w:pPr>
             <w:r>
               <w:rPr>
                 <w:sz w:val="28"/>
                 <w:szCs w:val="28"/>
-                <w:lang w:val="ru-RU"/>
               </w:rPr>
               <w:t>-</w:t>
             </w:r>
@@ -5724,14 +5567,12 @@
               <w:rPr>
                 <w:sz w:val="28"/>
                 <w:szCs w:val="28"/>
-                <w:lang w:val="ru-RU"/>
               </w:rPr>
             </w:pPr>
             <w:r>
               <w:rPr>
                 <w:sz w:val="28"/>
                 <w:szCs w:val="28"/>
-                <w:lang w:val="ru-RU"/>
               </w:rPr>
               <w:t>-</w:t>
             </w:r>
@@ -5747,14 +5588,12 @@
               <w:rPr>
                 <w:sz w:val="28"/>
                 <w:szCs w:val="28"/>
-                <w:lang w:val="ru-RU"/>
               </w:rPr>
             </w:pPr>
             <w:r>
               <w:rPr>
                 <w:sz w:val="28"/>
                 <w:szCs w:val="28"/>
-                <w:lang w:val="ru-RU"/>
               </w:rPr>
               <w:t>-</w:t>
             </w:r>
@@ -5801,14 +5640,12 @@
               <w:rPr>
                 <w:sz w:val="28"/>
                 <w:szCs w:val="28"/>
-                <w:lang w:val="ru-RU"/>
               </w:rPr>
             </w:pPr>
             <w:r>
               <w:rPr>
                 <w:sz w:val="28"/>
                 <w:szCs w:val="28"/>
-                <w:lang w:val="ru-RU"/>
               </w:rPr>
               <w:lastRenderedPageBreak/>
               <w:t>+</w:t>
@@ -5825,14 +5662,12 @@
               <w:rPr>
                 <w:sz w:val="28"/>
                 <w:szCs w:val="28"/>
-                <w:lang w:val="ru-RU"/>
               </w:rPr>
             </w:pPr>
             <w:r>
               <w:rPr>
                 <w:sz w:val="28"/>
                 <w:szCs w:val="28"/>
-                <w:lang w:val="ru-RU"/>
               </w:rPr>
               <w:t>-</w:t>
             </w:r>
@@ -5848,14 +5683,12 @@
               <w:rPr>
                 <w:sz w:val="28"/>
                 <w:szCs w:val="28"/>
-                <w:lang w:val="ru-RU"/>
               </w:rPr>
             </w:pPr>
             <w:r>
               <w:rPr>
                 <w:sz w:val="28"/>
                 <w:szCs w:val="28"/>
-                <w:lang w:val="ru-RU"/>
               </w:rPr>
               <w:t>-</w:t>
             </w:r>
@@ -6241,7 +6074,6 @@
         <w:rPr>
           <w:sz w:val="28"/>
           <w:szCs w:val="28"/>
-          <w:lang w:val="ru-RU"/>
         </w:rPr>
       </w:pPr>
       <w:r>
@@ -6257,7 +6089,6 @@
           <w:color w:val="000000"/>
           <w:sz w:val="28"/>
           <w:szCs w:val="28"/>
-          <w:lang w:val="ru-RU"/>
         </w:rPr>
         <w:br w:type="page"/>
       </w:r>
@@ -6771,15 +6602,13 @@
           <w:color w:val="000000"/>
           <w:sz w:val="28"/>
           <w:szCs w:val="28"/>
-          <w:lang w:val="ru-RU"/>
-        </w:rPr>
-      </w:pPr>
-      <w:r>
-        <w:rPr>
-          <w:color w:val="000000"/>
-          <w:sz w:val="28"/>
-          <w:szCs w:val="28"/>
-          <w:lang w:val="ru-RU"/>
+        </w:rPr>
+      </w:pPr>
+      <w:r>
+        <w:rPr>
+          <w:color w:val="000000"/>
+          <w:sz w:val="28"/>
+          <w:szCs w:val="28"/>
         </w:rPr>
         <w:br w:type="page"/>
       </w:r>
@@ -6877,15 +6706,13 @@
           <w:color w:val="000000"/>
           <w:sz w:val="28"/>
           <w:szCs w:val="28"/>
-          <w:lang w:val="ru-RU"/>
-        </w:rPr>
-      </w:pPr>
-      <w:r>
-        <w:rPr>
-          <w:color w:val="000000"/>
-          <w:sz w:val="28"/>
-          <w:szCs w:val="28"/>
-          <w:lang w:val="ru-RU"/>
+        </w:rPr>
+      </w:pPr>
+      <w:r>
+        <w:rPr>
+          <w:color w:val="000000"/>
+          <w:sz w:val="28"/>
+          <w:szCs w:val="28"/>
         </w:rPr>
         <w:t>Программный продукт «My Diary» имеет модульную архитектуру на уровне организации исходного кода. Приложение можно логически разделить на несколько ключевых взаимосвязанных структурных компонентов (модулей), каждый из которых отвечает за определенную часть функционала:</w:t>
       </w:r>
@@ -6909,15 +6736,13 @@
           <w:color w:val="000000"/>
           <w:sz w:val="28"/>
           <w:szCs w:val="28"/>
-          <w:lang w:val="ru-RU"/>
-        </w:rPr>
-      </w:pPr>
-      <w:r>
-        <w:rPr>
-          <w:color w:val="000000"/>
-          <w:sz w:val="28"/>
-          <w:szCs w:val="28"/>
-          <w:lang w:val="ru-RU"/>
+        </w:rPr>
+      </w:pPr>
+      <w:r>
+        <w:rPr>
+          <w:color w:val="000000"/>
+          <w:sz w:val="28"/>
+          <w:szCs w:val="28"/>
         </w:rPr>
         <w:t>Модуль инициализации и конфигурации (Core &amp; Settings Module): Отвечает за базовую настройку среды при запуске приложения. Включает в себя установку фиксированных размеров окна для десктопных платформ (500x900 пикселей) и инициализацию форматов дат. Также этот модуль содержит конфигуратор визуальных тем (ThemeConfig) и систему локализации.</w:t>
       </w:r>
@@ -6941,15 +6766,13 @@
           <w:color w:val="000000"/>
           <w:sz w:val="28"/>
           <w:szCs w:val="28"/>
-          <w:lang w:val="ru-RU"/>
-        </w:rPr>
-      </w:pPr>
-      <w:r>
-        <w:rPr>
-          <w:color w:val="000000"/>
-          <w:sz w:val="28"/>
-          <w:szCs w:val="28"/>
-          <w:lang w:val="ru-RU"/>
+        </w:rPr>
+      </w:pPr>
+      <w:r>
+        <w:rPr>
+          <w:color w:val="000000"/>
+          <w:sz w:val="28"/>
+          <w:szCs w:val="28"/>
         </w:rPr>
         <w:t>Модуль главного экрана (Home Screen Module): Представлен виджетом DiaryHomePage. Является точкой входа в интерфейс. Отвечает за отрисовку списка записей, навигацию (Drawer) и реализацию функции поиска.</w:t>
       </w:r>
@@ -6973,15 +6796,13 @@
           <w:color w:val="000000"/>
           <w:sz w:val="28"/>
           <w:szCs w:val="28"/>
-          <w:lang w:val="ru-RU"/>
-        </w:rPr>
-      </w:pPr>
-      <w:r>
-        <w:rPr>
-          <w:color w:val="000000"/>
-          <w:sz w:val="28"/>
-          <w:szCs w:val="28"/>
-          <w:lang w:val="ru-RU"/>
+        </w:rPr>
+      </w:pPr>
+      <w:r>
+        <w:rPr>
+          <w:color w:val="000000"/>
+          <w:sz w:val="28"/>
+          <w:szCs w:val="28"/>
         </w:rPr>
         <w:t>Модуль редактора контента (Editor Module): Реализован на базе экрана NewEntryScreen. Представляет собой комплексный инструмент для создания и модификации записей, использующий блочную систему (BlockContent) для чередования текста и локальных изображений.</w:t>
       </w:r>
@@ -7005,15 +6826,13 @@
           <w:color w:val="000000"/>
           <w:sz w:val="28"/>
           <w:szCs w:val="28"/>
-          <w:lang w:val="ru-RU"/>
-        </w:rPr>
-      </w:pPr>
-      <w:r>
-        <w:rPr>
-          <w:color w:val="000000"/>
-          <w:sz w:val="28"/>
-          <w:szCs w:val="28"/>
-          <w:lang w:val="ru-RU"/>
+        </w:rPr>
+      </w:pPr>
+      <w:r>
+        <w:rPr>
+          <w:color w:val="000000"/>
+          <w:sz w:val="28"/>
+          <w:szCs w:val="28"/>
         </w:rPr>
         <w:t>Модуль интерактивных элементов (Stickers System): Подсистема, накладываемая поверх основного редактора. Отвечает за рендеринг и взаимодействие с эмодзи-стикерами (PlacedSticker), обрабатывая жесты пользователя для их свободного позиционирования.</w:t>
       </w:r>
@@ -7037,15 +6856,13 @@
           <w:color w:val="000000"/>
           <w:sz w:val="28"/>
           <w:szCs w:val="28"/>
-          <w:lang w:val="ru-RU"/>
-        </w:rPr>
-      </w:pPr>
-      <w:r>
-        <w:rPr>
-          <w:color w:val="000000"/>
-          <w:sz w:val="28"/>
-          <w:szCs w:val="28"/>
-          <w:lang w:val="ru-RU"/>
+        </w:rPr>
+      </w:pPr>
+      <w:r>
+        <w:rPr>
+          <w:color w:val="000000"/>
+          <w:sz w:val="28"/>
+          <w:szCs w:val="28"/>
         </w:rPr>
         <w:t xml:space="preserve">Модуль хранения данных (Storage Module): Инкапсулирует логику работы с локальным хранилищем SharedPreferences. Обеспечивает </w:t>
       </w:r>
@@ -7054,7 +6871,6 @@
           <w:color w:val="000000"/>
           <w:sz w:val="28"/>
           <w:szCs w:val="28"/>
-          <w:lang w:val="ru-RU"/>
         </w:rPr>
         <w:lastRenderedPageBreak/>
         <w:t>конвертацию сложных структур в формат JSON для сохранения и их обратное преобразование при загрузке.</w:t>
@@ -7067,7 +6883,6 @@
           <w:noProof/>
           <w:sz w:val="28"/>
           <w:szCs w:val="28"/>
-          <w:lang w:val="ru-RU"/>
         </w:rPr>
       </w:pPr>
       <w:r>
@@ -7134,15 +6949,13 @@
           <w:color w:val="000000"/>
           <w:sz w:val="28"/>
           <w:szCs w:val="28"/>
-          <w:lang w:val="ru-RU"/>
-        </w:rPr>
-      </w:pPr>
-      <w:r>
-        <w:rPr>
-          <w:color w:val="000000"/>
-          <w:sz w:val="28"/>
-          <w:szCs w:val="28"/>
-          <w:lang w:val="ru-RU"/>
+        </w:rPr>
+      </w:pPr>
+      <w:r>
+        <w:rPr>
+          <w:color w:val="000000"/>
+          <w:sz w:val="28"/>
+          <w:szCs w:val="28"/>
         </w:rPr>
         <w:t>Функциональная схема приложения описывает потоки данных и алгоритмы взаимодействия между пользователем и системой. Для наглядного представления функциональных возможностей системы спроектирована диаграмма вариантов использования (Use Case).</w:t>
       </w:r>
@@ -7163,15 +6976,13 @@
           <w:color w:val="000000"/>
           <w:sz w:val="28"/>
           <w:szCs w:val="28"/>
-          <w:lang w:val="ru-RU"/>
-        </w:rPr>
-      </w:pPr>
-      <w:r>
-        <w:rPr>
-          <w:color w:val="000000"/>
-          <w:sz w:val="28"/>
-          <w:szCs w:val="28"/>
-          <w:lang w:val="ru-RU"/>
+        </w:rPr>
+      </w:pPr>
+      <w:r>
+        <w:rPr>
+          <w:color w:val="000000"/>
+          <w:sz w:val="28"/>
+          <w:szCs w:val="28"/>
         </w:rPr>
         <w:t>На рисунке 1 представлена диаграмма вариантов использования приложения «My Diary».</w:t>
       </w:r>
@@ -7194,6 +7005,58 @@
           <w:szCs w:val="28"/>
         </w:rPr>
       </w:pPr>
+      <w:r>
+        <w:rPr>
+          <w:noProof/>
+          <w:sz w:val="28"/>
+          <w:szCs w:val="28"/>
+        </w:rPr>
+        <w:drawing>
+          <wp:inline distT="0" distB="0" distL="0" distR="0">
+            <wp:extent cx="5221690" cy="2502187"/>
+            <wp:effectExtent l="19050" t="0" r="0" b="0"/>
+            <wp:docPr id="1" name="Рисунок 1" descr="C:\Users\Milina\Desktop\Диаграмма классов.png"/>
+            <wp:cNvGraphicFramePr>
+              <a:graphicFrameLocks xmlns:a="http://schemas.openxmlformats.org/drawingml/2006/main" noChangeAspect="1"/>
+            </wp:cNvGraphicFramePr>
+            <a:graphic xmlns:a="http://schemas.openxmlformats.org/drawingml/2006/main">
+              <a:graphicData uri="http://schemas.openxmlformats.org/drawingml/2006/picture">
+                <pic:pic xmlns:pic="http://schemas.openxmlformats.org/drawingml/2006/picture">
+                  <pic:nvPicPr>
+                    <pic:cNvPr id="0" name="Picture 1" descr="C:\Users\Milina\Desktop\Диаграмма классов.png"/>
+                    <pic:cNvPicPr>
+                      <a:picLocks noChangeAspect="1" noChangeArrowheads="1"/>
+                    </pic:cNvPicPr>
+                  </pic:nvPicPr>
+                  <pic:blipFill>
+                    <a:blip r:embed="rId8" cstate="print"/>
+                    <a:srcRect/>
+                    <a:stretch>
+                      <a:fillRect/>
+                    </a:stretch>
+                  </pic:blipFill>
+                  <pic:spPr bwMode="auto">
+                    <a:xfrm>
+                      <a:off x="0" y="0"/>
+                      <a:ext cx="5222629" cy="2502637"/>
+                    </a:xfrm>
+                    <a:prstGeom prst="rect">
+                      <a:avLst/>
+                    </a:prstGeom>
+                    <a:noFill/>
+                    <a:ln w="9525">
+                      <a:noFill/>
+                      <a:miter lim="800000"/>
+                      <a:headEnd/>
+                      <a:tailEnd/>
+                    </a:ln>
+                  </pic:spPr>
+                </pic:pic>
+              </a:graphicData>
+            </a:graphic>
+          </wp:inline>
+        </w:drawing>
+      </w:r>
     </w:p>
     <w:p>
       <w:pPr>
@@ -7203,7 +7066,6 @@
           <w:noProof/>
           <w:sz w:val="28"/>
           <w:szCs w:val="28"/>
-          <w:lang w:val="ru-RU"/>
         </w:rPr>
       </w:pPr>
       <w:r>
@@ -7212,7 +7074,23 @@
           <w:sz w:val="28"/>
           <w:szCs w:val="28"/>
         </w:rPr>
-        <w:t>Рисунок 3 – Диаграмма классов</w:t>
+        <w:t xml:space="preserve">Рисунок </w:t>
+      </w:r>
+      <w:r>
+        <w:rPr>
+          <w:noProof/>
+          <w:sz w:val="28"/>
+          <w:szCs w:val="28"/>
+        </w:rPr>
+        <w:t>3</w:t>
+      </w:r>
+      <w:r>
+        <w:rPr>
+          <w:noProof/>
+          <w:sz w:val="28"/>
+          <w:szCs w:val="28"/>
+        </w:rPr>
+        <w:t xml:space="preserve"> – Диаграмма классов</w:t>
       </w:r>
     </w:p>
     <w:p>
@@ -7231,15 +7109,13 @@
           <w:color w:val="000000"/>
           <w:sz w:val="28"/>
           <w:szCs w:val="28"/>
-          <w:lang w:val="ru-RU"/>
-        </w:rPr>
-      </w:pPr>
-      <w:r>
-        <w:rPr>
-          <w:color w:val="000000"/>
-          <w:sz w:val="28"/>
-          <w:szCs w:val="28"/>
-          <w:lang w:val="ru-RU"/>
+        </w:rPr>
+      </w:pPr>
+      <w:r>
+        <w:rPr>
+          <w:color w:val="000000"/>
+          <w:sz w:val="28"/>
+          <w:szCs w:val="28"/>
         </w:rPr>
         <w:t>Главным актором в системе выступает «Пользователь». Ему доступны следующие основные прецеденты:</w:t>
       </w:r>
@@ -7263,15 +7139,13 @@
           <w:color w:val="000000"/>
           <w:sz w:val="28"/>
           <w:szCs w:val="28"/>
-          <w:lang w:val="ru-RU"/>
-        </w:rPr>
-      </w:pPr>
-      <w:r>
-        <w:rPr>
-          <w:color w:val="000000"/>
-          <w:sz w:val="28"/>
-          <w:szCs w:val="28"/>
-          <w:lang w:val="ru-RU"/>
+        </w:rPr>
+      </w:pPr>
+      <w:r>
+        <w:rPr>
+          <w:color w:val="000000"/>
+          <w:sz w:val="28"/>
+          <w:szCs w:val="28"/>
         </w:rPr>
         <w:t>Управление настройками: выбор цветовой темы (темная, светлая, розовая) и языка интерфейса (русский/английский).</w:t>
       </w:r>
@@ -7295,15 +7169,13 @@
           <w:color w:val="000000"/>
           <w:sz w:val="28"/>
           <w:szCs w:val="28"/>
-          <w:lang w:val="ru-RU"/>
-        </w:rPr>
-      </w:pPr>
-      <w:r>
-        <w:rPr>
-          <w:color w:val="000000"/>
-          <w:sz w:val="28"/>
-          <w:szCs w:val="28"/>
-          <w:lang w:val="ru-RU"/>
+        </w:rPr>
+      </w:pPr>
+      <w:r>
+        <w:rPr>
+          <w:color w:val="000000"/>
+          <w:sz w:val="28"/>
+          <w:szCs w:val="28"/>
         </w:rPr>
         <w:t>Работа с дневником: создание новой записи, просмотр списка существующих заметок, поиск записей по тексту или заголовку.</w:t>
       </w:r>
@@ -7327,15 +7199,13 @@
           <w:color w:val="000000"/>
           <w:sz w:val="28"/>
           <w:szCs w:val="28"/>
-          <w:lang w:val="ru-RU"/>
-        </w:rPr>
-      </w:pPr>
-      <w:r>
-        <w:rPr>
-          <w:color w:val="000000"/>
-          <w:sz w:val="28"/>
-          <w:szCs w:val="28"/>
-          <w:lang w:val="ru-RU"/>
+        </w:rPr>
+      </w:pPr>
+      <w:r>
+        <w:rPr>
+          <w:color w:val="000000"/>
+          <w:sz w:val="28"/>
+          <w:szCs w:val="28"/>
         </w:rPr>
         <w:t>Редактирование контента (включается в создание записи): добавление текстовых блоков, вставка путей к локальным изображениям, выбор эмодзи для отслеживания настроения.</w:t>
       </w:r>
@@ -7359,15 +7229,13 @@
           <w:color w:val="000000"/>
           <w:sz w:val="28"/>
           <w:szCs w:val="28"/>
-          <w:lang w:val="ru-RU"/>
-        </w:rPr>
-      </w:pPr>
-      <w:r>
-        <w:rPr>
-          <w:color w:val="000000"/>
-          <w:sz w:val="28"/>
-          <w:szCs w:val="28"/>
-          <w:lang w:val="ru-RU"/>
+        </w:rPr>
+      </w:pPr>
+      <w:r>
+        <w:rPr>
+          <w:color w:val="000000"/>
+          <w:sz w:val="28"/>
+          <w:szCs w:val="28"/>
         </w:rPr>
         <w:t>Взаимодействие со стикерами: добавление интерактивных стикеров на холст, их перемещение (Drag-and-Drop) и удаление (двойным касанием).</w:t>
       </w:r>
@@ -7388,16 +7256,15 @@
           <w:color w:val="000000"/>
           <w:sz w:val="28"/>
           <w:szCs w:val="28"/>
-          <w:lang w:val="ru-RU"/>
-        </w:rPr>
-      </w:pPr>
-      <w:r>
-        <w:rPr>
-          <w:color w:val="000000"/>
-          <w:sz w:val="28"/>
-          <w:szCs w:val="28"/>
-          <w:lang w:val="ru-RU"/>
-        </w:rPr>
+        </w:rPr>
+      </w:pPr>
+      <w:r>
+        <w:rPr>
+          <w:color w:val="000000"/>
+          <w:sz w:val="28"/>
+          <w:szCs w:val="28"/>
+        </w:rPr>
+        <w:lastRenderedPageBreak/>
         <w:t>Для описания динамических аспектов системы и логики алгоритма сохранения данных была разработана диаграмма деятельности (Activity Diagram). Она иллюстрирует основной жизненный цикл создания и сохранения заметки.</w:t>
       </w:r>
     </w:p>
@@ -7417,15 +7284,13 @@
           <w:color w:val="000000"/>
           <w:sz w:val="28"/>
           <w:szCs w:val="28"/>
-          <w:lang w:val="ru-RU"/>
-        </w:rPr>
-      </w:pPr>
-      <w:r>
-        <w:rPr>
-          <w:color w:val="000000"/>
-          <w:sz w:val="28"/>
-          <w:szCs w:val="28"/>
-          <w:lang w:val="ru-RU"/>
+        </w:rPr>
+      </w:pPr>
+      <w:r>
+        <w:rPr>
+          <w:color w:val="000000"/>
+          <w:sz w:val="28"/>
+          <w:szCs w:val="28"/>
         </w:rPr>
         <w:t>На рисунке 2 представлена диаграмма деятельности процесса работы с записью.</w:t>
       </w:r>
@@ -7446,9 +7311,61 @@
           <w:color w:val="000000"/>
           <w:sz w:val="28"/>
           <w:szCs w:val="28"/>
-          <w:lang w:val="ru-RU"/>
-        </w:rPr>
-      </w:pPr>
+        </w:rPr>
+      </w:pPr>
+      <w:r>
+        <w:rPr>
+          <w:noProof/>
+          <w:color w:val="000000"/>
+          <w:sz w:val="28"/>
+          <w:szCs w:val="28"/>
+        </w:rPr>
+        <w:drawing>
+          <wp:inline distT="0" distB="0" distL="0" distR="0">
+            <wp:extent cx="2915218" cy="5777946"/>
+            <wp:effectExtent l="19050" t="0" r="0" b="0"/>
+            <wp:docPr id="2" name="Рисунок 2" descr="C:\Users\Milina\Desktop\Диаграмма деятельности процесса создания записи.png"/>
+            <wp:cNvGraphicFramePr>
+              <a:graphicFrameLocks xmlns:a="http://schemas.openxmlformats.org/drawingml/2006/main" noChangeAspect="1"/>
+            </wp:cNvGraphicFramePr>
+            <a:graphic xmlns:a="http://schemas.openxmlformats.org/drawingml/2006/main">
+              <a:graphicData uri="http://schemas.openxmlformats.org/drawingml/2006/picture">
+                <pic:pic xmlns:pic="http://schemas.openxmlformats.org/drawingml/2006/picture">
+                  <pic:nvPicPr>
+                    <pic:cNvPr id="0" name="Picture 2" descr="C:\Users\Milina\Desktop\Диаграмма деятельности процесса создания записи.png"/>
+                    <pic:cNvPicPr>
+                      <a:picLocks noChangeAspect="1" noChangeArrowheads="1"/>
+                    </pic:cNvPicPr>
+                  </pic:nvPicPr>
+                  <pic:blipFill>
+                    <a:blip r:embed="rId9" cstate="print"/>
+                    <a:srcRect/>
+                    <a:stretch>
+                      <a:fillRect/>
+                    </a:stretch>
+                  </pic:blipFill>
+                  <pic:spPr bwMode="auto">
+                    <a:xfrm>
+                      <a:off x="0" y="0"/>
+                      <a:ext cx="2913788" cy="5775112"/>
+                    </a:xfrm>
+                    <a:prstGeom prst="rect">
+                      <a:avLst/>
+                    </a:prstGeom>
+                    <a:noFill/>
+                    <a:ln w="9525">
+                      <a:noFill/>
+                      <a:miter lim="800000"/>
+                      <a:headEnd/>
+                      <a:tailEnd/>
+                    </a:ln>
+                  </pic:spPr>
+                </pic:pic>
+              </a:graphicData>
+            </a:graphic>
+          </wp:inline>
+        </w:drawing>
+      </w:r>
     </w:p>
     <w:p>
       <w:pPr>
@@ -7458,7 +7375,6 @@
           <w:noProof/>
           <w:sz w:val="28"/>
           <w:szCs w:val="28"/>
-          <w:lang w:val="ru-RU"/>
         </w:rPr>
       </w:pPr>
       <w:r>
@@ -7467,7 +7383,6 @@
           <w:sz w:val="28"/>
           <w:szCs w:val="28"/>
         </w:rPr>
-        <w:lastRenderedPageBreak/>
         <w:t>Рисунок 2 — Диаграмма деятельности процесса создания записи</w:t>
       </w:r>
     </w:p>
@@ -7487,15 +7402,13 @@
           <w:color w:val="000000"/>
           <w:sz w:val="28"/>
           <w:szCs w:val="28"/>
-          <w:lang w:val="ru-RU"/>
-        </w:rPr>
-      </w:pPr>
-      <w:r>
-        <w:rPr>
-          <w:color w:val="000000"/>
-          <w:sz w:val="28"/>
-          <w:szCs w:val="28"/>
-          <w:lang w:val="ru-RU"/>
+        </w:rPr>
+      </w:pPr>
+      <w:r>
+        <w:rPr>
+          <w:color w:val="000000"/>
+          <w:sz w:val="28"/>
+          <w:szCs w:val="28"/>
         </w:rPr>
         <w:t>Процесс создания и редактирования записи, отраженный на диаграмме:</w:t>
       </w:r>
@@ -7519,16 +7432,15 @@
           <w:color w:val="000000"/>
           <w:sz w:val="28"/>
           <w:szCs w:val="28"/>
-          <w:lang w:val="ru-RU"/>
-        </w:rPr>
-      </w:pPr>
-      <w:r>
-        <w:rPr>
-          <w:color w:val="000000"/>
-          <w:sz w:val="28"/>
-          <w:szCs w:val="28"/>
-          <w:lang w:val="ru-RU"/>
-        </w:rPr>
+        </w:rPr>
+      </w:pPr>
+      <w:r>
+        <w:rPr>
+          <w:color w:val="000000"/>
+          <w:sz w:val="28"/>
+          <w:szCs w:val="28"/>
+        </w:rPr>
+        <w:lastRenderedPageBreak/>
         <w:t>Пользователь инициирует создание новой заметки (переход на NewEntryScreen).</w:t>
       </w:r>
     </w:p>
@@ -7551,15 +7463,13 @@
           <w:color w:val="000000"/>
           <w:sz w:val="28"/>
           <w:szCs w:val="28"/>
-          <w:lang w:val="ru-RU"/>
-        </w:rPr>
-      </w:pPr>
-      <w:r>
-        <w:rPr>
-          <w:color w:val="000000"/>
-          <w:sz w:val="28"/>
-          <w:szCs w:val="28"/>
-          <w:lang w:val="ru-RU"/>
+        </w:rPr>
+      </w:pPr>
+      <w:r>
+        <w:rPr>
+          <w:color w:val="000000"/>
+          <w:sz w:val="28"/>
+          <w:szCs w:val="28"/>
         </w:rPr>
         <w:t>Система генерирует уникальный идентификатор записи.</w:t>
       </w:r>
@@ -7583,15 +7493,13 @@
           <w:color w:val="000000"/>
           <w:sz w:val="28"/>
           <w:szCs w:val="28"/>
-          <w:lang w:val="ru-RU"/>
-        </w:rPr>
-      </w:pPr>
-      <w:r>
-        <w:rPr>
-          <w:color w:val="000000"/>
-          <w:sz w:val="28"/>
-          <w:szCs w:val="28"/>
-          <w:lang w:val="ru-RU"/>
+        </w:rPr>
+      </w:pPr>
+      <w:r>
+        <w:rPr>
+          <w:color w:val="000000"/>
+          <w:sz w:val="28"/>
+          <w:szCs w:val="28"/>
         </w:rPr>
         <w:t>Пользователь вводит данные: печатает текст, прикрепляет изображения или размещает стикеры поверх контента.</w:t>
       </w:r>
@@ -7615,15 +7523,13 @@
           <w:color w:val="000000"/>
           <w:sz w:val="28"/>
           <w:szCs w:val="28"/>
-          <w:lang w:val="ru-RU"/>
-        </w:rPr>
-      </w:pPr>
-      <w:r>
-        <w:rPr>
-          <w:color w:val="000000"/>
-          <w:sz w:val="28"/>
-          <w:szCs w:val="28"/>
-          <w:lang w:val="ru-RU"/>
+        </w:rPr>
+      </w:pPr>
+      <w:r>
+        <w:rPr>
+          <w:color w:val="000000"/>
+          <w:sz w:val="28"/>
+          <w:szCs w:val="28"/>
         </w:rPr>
         <w:t>Любое изменение состояния на экране (ввод символа, сдвиг координат стикера) автоматически инициирует триггер автосохранения (_triggerAutoSave).</w:t>
       </w:r>
@@ -7647,15 +7553,13 @@
           <w:color w:val="000000"/>
           <w:sz w:val="28"/>
           <w:szCs w:val="28"/>
-          <w:lang w:val="ru-RU"/>
-        </w:rPr>
-      </w:pPr>
-      <w:r>
-        <w:rPr>
-          <w:color w:val="000000"/>
-          <w:sz w:val="28"/>
-          <w:szCs w:val="28"/>
-          <w:lang w:val="ru-RU"/>
+        </w:rPr>
+      </w:pPr>
+      <w:r>
+        <w:rPr>
+          <w:color w:val="000000"/>
+          <w:sz w:val="28"/>
+          <w:szCs w:val="28"/>
         </w:rPr>
         <w:t>Система формирует комплексный объект DiaryEntry, выполняет сериализацию данных в JSON-строку.</w:t>
       </w:r>
@@ -7679,15 +7583,13 @@
           <w:color w:val="000000"/>
           <w:sz w:val="28"/>
           <w:szCs w:val="28"/>
-          <w:lang w:val="ru-RU"/>
-        </w:rPr>
-      </w:pPr>
-      <w:r>
-        <w:rPr>
-          <w:color w:val="000000"/>
-          <w:sz w:val="28"/>
-          <w:szCs w:val="28"/>
-          <w:lang w:val="ru-RU"/>
+        </w:rPr>
+      </w:pPr>
+      <w:r>
+        <w:rPr>
+          <w:color w:val="000000"/>
+          <w:sz w:val="28"/>
+          <w:szCs w:val="28"/>
         </w:rPr>
         <w:t>Выполняется асинхронная запись обновленной строки в SharedPreferences.</w:t>
       </w:r>
@@ -7711,15 +7613,13 @@
           <w:color w:val="000000"/>
           <w:sz w:val="28"/>
           <w:szCs w:val="28"/>
-          <w:lang w:val="ru-RU"/>
-        </w:rPr>
-      </w:pPr>
-      <w:r>
-        <w:rPr>
-          <w:color w:val="000000"/>
-          <w:sz w:val="28"/>
-          <w:szCs w:val="28"/>
-          <w:lang w:val="ru-RU"/>
+        </w:rPr>
+      </w:pPr>
+      <w:r>
+        <w:rPr>
+          <w:color w:val="000000"/>
+          <w:sz w:val="28"/>
+          <w:szCs w:val="28"/>
         </w:rPr>
         <w:t>При возврате назад система обновляет стейт главного экрана и выводит актуализированный список записей.</w:t>
       </w:r>
@@ -7732,7 +7632,6 @@
           <w:noProof/>
           <w:sz w:val="28"/>
           <w:szCs w:val="28"/>
-          <w:lang w:val="ru-RU"/>
         </w:rPr>
       </w:pPr>
       <w:r>
@@ -7833,15 +7732,13 @@
           <w:color w:val="000000"/>
           <w:sz w:val="28"/>
           <w:szCs w:val="28"/>
-          <w:lang w:val="ru-RU"/>
-        </w:rPr>
-      </w:pPr>
-      <w:r>
-        <w:rPr>
-          <w:color w:val="000000"/>
-          <w:sz w:val="28"/>
-          <w:szCs w:val="28"/>
-          <w:lang w:val="ru-RU"/>
+        </w:rPr>
+      </w:pPr>
+      <w:r>
+        <w:rPr>
+          <w:color w:val="000000"/>
+          <w:sz w:val="28"/>
+          <w:szCs w:val="28"/>
         </w:rPr>
         <w:t>Пользовательский интерфейс (UI) приложения «My Diary» спроектирован с упором на минимализм, отсутствие отвлекающих элементов и высокую степень персонализации. В основе визуального стиля лежит использование библиотеки Material Design, адаптированной под нужды электронного дневника.</w:t>
       </w:r>
@@ -7862,15 +7759,13 @@
           <w:color w:val="000000"/>
           <w:sz w:val="28"/>
           <w:szCs w:val="28"/>
-          <w:lang w:val="ru-RU"/>
-        </w:rPr>
-      </w:pPr>
-      <w:r>
-        <w:rPr>
-          <w:color w:val="000000"/>
-          <w:sz w:val="28"/>
-          <w:szCs w:val="28"/>
-          <w:lang w:val="ru-RU"/>
+        </w:rPr>
+      </w:pPr>
+      <w:r>
+        <w:rPr>
+          <w:color w:val="000000"/>
+          <w:sz w:val="28"/>
+          <w:szCs w:val="28"/>
         </w:rPr>
         <w:t>Ключевой особенностью интерфейса является система встроенных тем (AppTheme), которая кардинально меняет цветовое восприятие приложения (Deep Blue, Mint Green, Cherry Pink). Фоны экранов используют плавные линейные градиенты (LinearGradient), что придает интерфейсу глубину и современный внешний вид.</w:t>
       </w:r>
@@ -7893,7 +7788,6 @@
           <w:color w:val="000000"/>
           <w:sz w:val="28"/>
           <w:szCs w:val="28"/>
-          <w:lang w:val="ru-RU"/>
         </w:rPr>
       </w:pPr>
       <w:bookmarkStart w:id="24" w:name="_Toc230714482"/>
@@ -7926,15 +7820,13 @@
           <w:color w:val="000000"/>
           <w:sz w:val="28"/>
           <w:szCs w:val="28"/>
-          <w:lang w:val="ru-RU"/>
-        </w:rPr>
-      </w:pPr>
-      <w:r>
-        <w:rPr>
-          <w:color w:val="000000"/>
-          <w:sz w:val="28"/>
-          <w:szCs w:val="28"/>
-          <w:lang w:val="ru-RU"/>
+        </w:rPr>
+      </w:pPr>
+      <w:r>
+        <w:rPr>
+          <w:color w:val="000000"/>
+          <w:sz w:val="28"/>
+          <w:szCs w:val="28"/>
         </w:rPr>
         <w:t>Взаимодействие пользователя с приложением построено на основе стековой навигации (Navigator).</w:t>
       </w:r>
@@ -7955,15 +7847,13 @@
           <w:color w:val="000000"/>
           <w:sz w:val="28"/>
           <w:szCs w:val="28"/>
-          <w:lang w:val="ru-RU"/>
-        </w:rPr>
-      </w:pPr>
-      <w:r>
-        <w:rPr>
-          <w:color w:val="000000"/>
-          <w:sz w:val="28"/>
-          <w:szCs w:val="28"/>
-          <w:lang w:val="ru-RU"/>
+        </w:rPr>
+      </w:pPr>
+      <w:r>
+        <w:rPr>
+          <w:color w:val="000000"/>
+          <w:sz w:val="28"/>
+          <w:szCs w:val="28"/>
         </w:rPr>
         <w:t>Главный экран включает в себя:</w:t>
       </w:r>
@@ -7987,15 +7877,13 @@
           <w:color w:val="000000"/>
           <w:sz w:val="28"/>
           <w:szCs w:val="28"/>
-          <w:lang w:val="ru-RU"/>
-        </w:rPr>
-      </w:pPr>
-      <w:r>
-        <w:rPr>
-          <w:color w:val="000000"/>
-          <w:sz w:val="28"/>
-          <w:szCs w:val="28"/>
-          <w:lang w:val="ru-RU"/>
+        </w:rPr>
+      </w:pPr>
+      <w:r>
+        <w:rPr>
+          <w:color w:val="000000"/>
+          <w:sz w:val="28"/>
+          <w:szCs w:val="28"/>
         </w:rPr>
         <w:t>Верхнюю панель (AppBar) с интегрированной анимированной строкой поиска.</w:t>
       </w:r>
@@ -8019,15 +7907,13 @@
           <w:color w:val="000000"/>
           <w:sz w:val="28"/>
           <w:szCs w:val="28"/>
-          <w:lang w:val="ru-RU"/>
-        </w:rPr>
-      </w:pPr>
-      <w:r>
-        <w:rPr>
-          <w:color w:val="000000"/>
-          <w:sz w:val="28"/>
-          <w:szCs w:val="28"/>
-          <w:lang w:val="ru-RU"/>
+        </w:rPr>
+      </w:pPr>
+      <w:r>
+        <w:rPr>
+          <w:color w:val="000000"/>
+          <w:sz w:val="28"/>
+          <w:szCs w:val="28"/>
         </w:rPr>
         <w:t>Основную рабочую область с карточками заметок (с эффектом полупрозрачного стекла).</w:t>
       </w:r>
@@ -8051,15 +7937,13 @@
           <w:color w:val="000000"/>
           <w:sz w:val="28"/>
           <w:szCs w:val="28"/>
-          <w:lang w:val="ru-RU"/>
-        </w:rPr>
-      </w:pPr>
-      <w:r>
-        <w:rPr>
-          <w:color w:val="000000"/>
-          <w:sz w:val="28"/>
-          <w:szCs w:val="28"/>
-          <w:lang w:val="ru-RU"/>
+        </w:rPr>
+      </w:pPr>
+      <w:r>
+        <w:rPr>
+          <w:color w:val="000000"/>
+          <w:sz w:val="28"/>
+          <w:szCs w:val="28"/>
         </w:rPr>
         <w:t>Боковое навигационное меню (Drawer) для управления настройками.</w:t>
       </w:r>
@@ -8080,15 +7964,13 @@
           <w:color w:val="000000"/>
           <w:sz w:val="28"/>
           <w:szCs w:val="28"/>
-          <w:lang w:val="ru-RU"/>
-        </w:rPr>
-      </w:pPr>
-      <w:r>
-        <w:rPr>
-          <w:color w:val="000000"/>
-          <w:sz w:val="28"/>
-          <w:szCs w:val="28"/>
-          <w:lang w:val="ru-RU"/>
+        </w:rPr>
+      </w:pPr>
+      <w:r>
+        <w:rPr>
+          <w:color w:val="000000"/>
+          <w:sz w:val="28"/>
+          <w:szCs w:val="28"/>
         </w:rPr>
         <w:t>Экран редактирования записи представляет собой бесконечный скроллируемый холст. Он разделен на базовый слой контента (текстовые поля, изображения, переключатель настроения) и слой наложения (Stack), в котором рендерятся интерактивные стикеры. Этот слой перехватывает нажатия и позволяет пользователю беспрепятственно перемещать элементы в пределах видимой области экрана.</w:t>
       </w:r>
@@ -8097,7 +7979,6 @@
           <w:noProof/>
           <w:sz w:val="28"/>
           <w:szCs w:val="28"/>
-          <w:lang w:val="ru-RU"/>
         </w:rPr>
         <w:br w:type="page"/>
       </w:r>
@@ -8149,7 +8030,6 @@
         <w:rPr>
           <w:sz w:val="28"/>
           <w:szCs w:val="28"/>
-          <w:lang w:val="ru-RU"/>
         </w:rPr>
       </w:pPr>
       <w:r>
@@ -8210,15 +8090,13 @@
           <w:color w:val="000000"/>
           <w:sz w:val="28"/>
           <w:szCs w:val="28"/>
-          <w:lang w:val="ru-RU"/>
-        </w:rPr>
-      </w:pPr>
-      <w:r>
-        <w:rPr>
-          <w:color w:val="000000"/>
-          <w:sz w:val="28"/>
-          <w:szCs w:val="28"/>
-          <w:lang w:val="ru-RU"/>
+        </w:rPr>
+      </w:pPr>
+      <w:r>
+        <w:rPr>
+          <w:color w:val="000000"/>
+          <w:sz w:val="28"/>
+          <w:szCs w:val="28"/>
         </w:rPr>
         <w:t>Инфологическая (концептуальная) модель представляет собой описание структуры и содержания данных, а также связей между ними на уровне абстракции, без привязки к конкретной реализации в СУБД. В приложении выделяются три основные сущности, напрямую отражающие модели данных клиентской части:</w:t>
       </w:r>
@@ -8341,15 +8219,13 @@
           <w:color w:val="000000"/>
           <w:sz w:val="28"/>
           <w:szCs w:val="28"/>
-          <w:lang w:val="ru-RU"/>
-        </w:rPr>
-      </w:pPr>
-      <w:r>
-        <w:rPr>
-          <w:color w:val="000000"/>
-          <w:sz w:val="28"/>
-          <w:szCs w:val="28"/>
-          <w:lang w:val="ru-RU"/>
+        </w:rPr>
+      </w:pPr>
+      <w:r>
+        <w:rPr>
+          <w:color w:val="000000"/>
+          <w:sz w:val="28"/>
+          <w:szCs w:val="28"/>
         </w:rPr>
         <w:t>Связь между сущностью «Запись» и сущностями «Блок контента» и «Стикер» определяется как «один-ко-многим» (1:M). Одна запись в дневнике может содержать множество текстовых блоков, изображений и стикеров, но каждый конкретный блок или стикер жестко привязан только к одной записи.</w:t>
       </w:r>
@@ -8370,15 +8246,13 @@
           <w:color w:val="000000"/>
           <w:sz w:val="28"/>
           <w:szCs w:val="28"/>
-          <w:lang w:val="ru-RU"/>
-        </w:rPr>
-      </w:pPr>
-      <w:r>
-        <w:rPr>
-          <w:color w:val="000000"/>
-          <w:sz w:val="28"/>
-          <w:szCs w:val="28"/>
-          <w:lang w:val="ru-RU"/>
+        </w:rPr>
+      </w:pPr>
+      <w:r>
+        <w:rPr>
+          <w:color w:val="000000"/>
+          <w:sz w:val="28"/>
+          <w:szCs w:val="28"/>
         </w:rPr>
         <w:t>Ниже приведено детальное описание структуры таблиц, спроектированных для реализации функционала приложения.</w:t>
       </w:r>
@@ -8434,15 +8308,13 @@
           <w:color w:val="000000"/>
           <w:sz w:val="28"/>
           <w:szCs w:val="28"/>
-          <w:lang w:val="ru-RU"/>
-        </w:rPr>
-      </w:pPr>
-      <w:r>
-        <w:rPr>
-          <w:color w:val="000000"/>
-          <w:sz w:val="28"/>
-          <w:szCs w:val="28"/>
-          <w:lang w:val="ru-RU"/>
+        </w:rPr>
+      </w:pPr>
+      <w:r>
+        <w:rPr>
+          <w:color w:val="000000"/>
+          <w:sz w:val="28"/>
+          <w:szCs w:val="28"/>
         </w:rPr>
         <w:t>Данная таблица является мастер-таблицей и служит для хранения основной метаинформации о созданных страницах дневника.</w:t>
       </w:r>
@@ -8463,15 +8335,13 @@
           <w:color w:val="000000"/>
           <w:sz w:val="28"/>
           <w:szCs w:val="28"/>
-          <w:lang w:val="ru-RU"/>
-        </w:rPr>
-      </w:pPr>
-      <w:r>
-        <w:rPr>
-          <w:color w:val="000000"/>
-          <w:sz w:val="28"/>
-          <w:szCs w:val="28"/>
-          <w:lang w:val="ru-RU"/>
+        </w:rPr>
+      </w:pPr>
+      <w:r>
+        <w:rPr>
+          <w:color w:val="000000"/>
+          <w:sz w:val="28"/>
+          <w:szCs w:val="28"/>
         </w:rPr>
         <w:t>Таблица 1 – Спецификация таблицы «entries»</w:t>
       </w:r>
@@ -8523,7 +8393,6 @@
               <w:rPr>
                 <w:sz w:val="28"/>
                 <w:szCs w:val="28"/>
-                <w:lang w:val="ru-RU"/>
               </w:rPr>
             </w:pPr>
             <w:r>
@@ -8532,7 +8401,6 @@
                 <w:bCs/>
                 <w:sz w:val="28"/>
                 <w:szCs w:val="28"/>
-                <w:lang w:val="ru-RU"/>
               </w:rPr>
               <w:t>Имя поля</w:t>
             </w:r>
@@ -8562,7 +8430,6 @@
               <w:rPr>
                 <w:sz w:val="28"/>
                 <w:szCs w:val="28"/>
-                <w:lang w:val="ru-RU"/>
               </w:rPr>
             </w:pPr>
             <w:r>
@@ -8571,7 +8438,6 @@
                 <w:bCs/>
                 <w:sz w:val="28"/>
                 <w:szCs w:val="28"/>
-                <w:lang w:val="ru-RU"/>
               </w:rPr>
               <w:t>Тип данных</w:t>
             </w:r>
@@ -8601,7 +8467,6 @@
               <w:rPr>
                 <w:sz w:val="28"/>
                 <w:szCs w:val="28"/>
-                <w:lang w:val="ru-RU"/>
               </w:rPr>
             </w:pPr>
             <w:r>
@@ -8610,7 +8475,6 @@
                 <w:bCs/>
                 <w:sz w:val="28"/>
                 <w:szCs w:val="28"/>
-                <w:lang w:val="ru-RU"/>
               </w:rPr>
               <w:t>Описание</w:t>
             </w:r>
@@ -8640,7 +8504,6 @@
               <w:rPr>
                 <w:sz w:val="28"/>
                 <w:szCs w:val="28"/>
-                <w:lang w:val="ru-RU"/>
               </w:rPr>
             </w:pPr>
             <w:r>
@@ -8649,7 +8512,6 @@
                 <w:bCs/>
                 <w:sz w:val="28"/>
                 <w:szCs w:val="28"/>
-                <w:lang w:val="ru-RU"/>
               </w:rPr>
               <w:t>Ограничения</w:t>
             </w:r>
@@ -8685,14 +8547,12 @@
               <w:rPr>
                 <w:sz w:val="28"/>
                 <w:szCs w:val="28"/>
-                <w:lang w:val="ru-RU"/>
               </w:rPr>
             </w:pPr>
             <w:r>
               <w:rPr>
                 <w:sz w:val="28"/>
                 <w:szCs w:val="28"/>
-                <w:lang w:val="ru-RU"/>
               </w:rPr>
               <w:t>id</w:t>
             </w:r>
@@ -8722,14 +8582,12 @@
               <w:rPr>
                 <w:sz w:val="28"/>
                 <w:szCs w:val="28"/>
-                <w:lang w:val="ru-RU"/>
               </w:rPr>
             </w:pPr>
             <w:r>
               <w:rPr>
                 <w:sz w:val="28"/>
                 <w:szCs w:val="28"/>
-                <w:lang w:val="ru-RU"/>
               </w:rPr>
               <w:t>TEXT</w:t>
             </w:r>
@@ -8759,14 +8617,12 @@
               <w:rPr>
                 <w:sz w:val="28"/>
                 <w:szCs w:val="28"/>
-                <w:lang w:val="ru-RU"/>
               </w:rPr>
             </w:pPr>
             <w:r>
               <w:rPr>
                 <w:sz w:val="28"/>
                 <w:szCs w:val="28"/>
-                <w:lang w:val="ru-RU"/>
               </w:rPr>
               <w:t>Уникальный идентификатор записи</w:t>
             </w:r>
@@ -8796,14 +8652,12 @@
               <w:rPr>
                 <w:sz w:val="28"/>
                 <w:szCs w:val="28"/>
-                <w:lang w:val="ru-RU"/>
               </w:rPr>
             </w:pPr>
             <w:r>
               <w:rPr>
                 <w:sz w:val="28"/>
                 <w:szCs w:val="28"/>
-                <w:lang w:val="ru-RU"/>
               </w:rPr>
               <w:t>Primary Key, Not Null</w:t>
             </w:r>
@@ -8839,14 +8693,12 @@
               <w:rPr>
                 <w:sz w:val="28"/>
                 <w:szCs w:val="28"/>
-                <w:lang w:val="ru-RU"/>
               </w:rPr>
             </w:pPr>
             <w:r>
               <w:rPr>
                 <w:sz w:val="28"/>
                 <w:szCs w:val="28"/>
-                <w:lang w:val="ru-RU"/>
               </w:rPr>
               <w:t>title</w:t>
             </w:r>
@@ -8876,14 +8728,12 @@
               <w:rPr>
                 <w:sz w:val="28"/>
                 <w:szCs w:val="28"/>
-                <w:lang w:val="ru-RU"/>
               </w:rPr>
             </w:pPr>
             <w:r>
               <w:rPr>
                 <w:sz w:val="28"/>
                 <w:szCs w:val="28"/>
-                <w:lang w:val="ru-RU"/>
               </w:rPr>
               <w:t>TEXT</w:t>
             </w:r>
@@ -8913,14 +8763,12 @@
               <w:rPr>
                 <w:sz w:val="28"/>
                 <w:szCs w:val="28"/>
-                <w:lang w:val="ru-RU"/>
               </w:rPr>
             </w:pPr>
             <w:r>
               <w:rPr>
                 <w:sz w:val="28"/>
                 <w:szCs w:val="28"/>
-                <w:lang w:val="ru-RU"/>
               </w:rPr>
               <w:t>Заголовок записи</w:t>
             </w:r>
@@ -8950,14 +8798,12 @@
               <w:rPr>
                 <w:sz w:val="28"/>
                 <w:szCs w:val="28"/>
-                <w:lang w:val="ru-RU"/>
               </w:rPr>
             </w:pPr>
             <w:r>
               <w:rPr>
                 <w:sz w:val="28"/>
                 <w:szCs w:val="28"/>
-                <w:lang w:val="ru-RU"/>
               </w:rPr>
               <w:t>Not Null</w:t>
             </w:r>
@@ -8992,14 +8838,12 @@
               <w:rPr>
                 <w:sz w:val="28"/>
                 <w:szCs w:val="28"/>
-                <w:lang w:val="ru-RU"/>
               </w:rPr>
             </w:pPr>
             <w:r>
               <w:rPr>
                 <w:sz w:val="28"/>
                 <w:szCs w:val="28"/>
-                <w:lang w:val="ru-RU"/>
               </w:rPr>
               <w:t>date</w:t>
             </w:r>
@@ -9029,14 +8873,12 @@
               <w:rPr>
                 <w:sz w:val="28"/>
                 <w:szCs w:val="28"/>
-                <w:lang w:val="ru-RU"/>
               </w:rPr>
             </w:pPr>
             <w:r>
               <w:rPr>
                 <w:sz w:val="28"/>
                 <w:szCs w:val="28"/>
-                <w:lang w:val="ru-RU"/>
               </w:rPr>
               <w:t>DATETIME</w:t>
             </w:r>
@@ -9066,14 +8908,12 @@
               <w:rPr>
                 <w:sz w:val="28"/>
                 <w:szCs w:val="28"/>
-                <w:lang w:val="ru-RU"/>
               </w:rPr>
             </w:pPr>
             <w:r>
               <w:rPr>
                 <w:sz w:val="28"/>
                 <w:szCs w:val="28"/>
-                <w:lang w:val="ru-RU"/>
               </w:rPr>
               <w:t>Дата и время, к которым относится запись</w:t>
             </w:r>
@@ -9103,14 +8943,12 @@
               <w:rPr>
                 <w:sz w:val="28"/>
                 <w:szCs w:val="28"/>
-                <w:lang w:val="ru-RU"/>
               </w:rPr>
             </w:pPr>
             <w:r>
               <w:rPr>
                 <w:sz w:val="28"/>
                 <w:szCs w:val="28"/>
-                <w:lang w:val="ru-RU"/>
               </w:rPr>
               <w:t>Not Null</w:t>
             </w:r>
@@ -9146,14 +8984,12 @@
               <w:rPr>
                 <w:sz w:val="28"/>
                 <w:szCs w:val="28"/>
-                <w:lang w:val="ru-RU"/>
               </w:rPr>
             </w:pPr>
             <w:r>
               <w:rPr>
                 <w:sz w:val="28"/>
                 <w:szCs w:val="28"/>
-                <w:lang w:val="ru-RU"/>
               </w:rPr>
               <w:t>mood_emoji</w:t>
             </w:r>
@@ -9183,14 +9019,12 @@
               <w:rPr>
                 <w:sz w:val="28"/>
                 <w:szCs w:val="28"/>
-                <w:lang w:val="ru-RU"/>
               </w:rPr>
             </w:pPr>
             <w:r>
               <w:rPr>
                 <w:sz w:val="28"/>
                 <w:szCs w:val="28"/>
-                <w:lang w:val="ru-RU"/>
               </w:rPr>
               <w:t>TEXT</w:t>
             </w:r>
@@ -9220,14 +9054,12 @@
               <w:rPr>
                 <w:sz w:val="28"/>
                 <w:szCs w:val="28"/>
-                <w:lang w:val="ru-RU"/>
               </w:rPr>
             </w:pPr>
             <w:r>
               <w:rPr>
                 <w:sz w:val="28"/>
                 <w:szCs w:val="28"/>
-                <w:lang w:val="ru-RU"/>
               </w:rPr>
               <w:t>Эмодзи настроения, выбранное пользователем</w:t>
             </w:r>
@@ -9257,14 +9089,12 @@
               <w:rPr>
                 <w:sz w:val="28"/>
                 <w:szCs w:val="28"/>
-                <w:lang w:val="ru-RU"/>
               </w:rPr>
             </w:pPr>
             <w:r>
               <w:rPr>
                 <w:sz w:val="28"/>
                 <w:szCs w:val="28"/>
-                <w:lang w:val="ru-RU"/>
               </w:rPr>
               <w:t>Default '</w:t>
             </w:r>
@@ -9273,7 +9103,6 @@
                 <w:rFonts w:ascii="Segoe UI Emoji" w:hAnsi="Segoe UI Emoji" w:cs="Segoe UI Emoji"/>
                 <w:sz w:val="28"/>
                 <w:szCs w:val="28"/>
-                <w:lang w:val="ru-RU"/>
               </w:rPr>
               <w:t>😊</w:t>
             </w:r>
@@ -9281,7 +9110,6 @@
               <w:rPr>
                 <w:sz w:val="28"/>
                 <w:szCs w:val="28"/>
-                <w:lang w:val="ru-RU"/>
               </w:rPr>
               <w:t>'</w:t>
             </w:r>
@@ -9339,15 +9167,13 @@
           <w:color w:val="000000"/>
           <w:sz w:val="28"/>
           <w:szCs w:val="28"/>
-          <w:lang w:val="ru-RU"/>
-        </w:rPr>
-      </w:pPr>
-      <w:r>
-        <w:rPr>
-          <w:color w:val="000000"/>
-          <w:sz w:val="28"/>
-          <w:szCs w:val="28"/>
-          <w:lang w:val="ru-RU"/>
+        </w:rPr>
+      </w:pPr>
+      <w:r>
+        <w:rPr>
+          <w:color w:val="000000"/>
+          <w:sz w:val="28"/>
+          <w:szCs w:val="28"/>
         </w:rPr>
         <w:t>Таблица предназначена для хранения изменяемого контента внутри записи. Разделение текста и изображений на блоки позволяет гибко управлять содержимым дневника.</w:t>
       </w:r>
@@ -9368,15 +9194,13 @@
           <w:color w:val="000000"/>
           <w:sz w:val="28"/>
           <w:szCs w:val="28"/>
-          <w:lang w:val="ru-RU"/>
-        </w:rPr>
-      </w:pPr>
-      <w:r>
-        <w:rPr>
-          <w:color w:val="000000"/>
-          <w:sz w:val="28"/>
-          <w:szCs w:val="28"/>
-          <w:lang w:val="ru-RU"/>
+        </w:rPr>
+      </w:pPr>
+      <w:r>
+        <w:rPr>
+          <w:color w:val="000000"/>
+          <w:sz w:val="28"/>
+          <w:szCs w:val="28"/>
         </w:rPr>
         <w:t>Таблица 2 – Спецификация таблицы «blocks»</w:t>
       </w:r>
@@ -9428,7 +9252,6 @@
               <w:rPr>
                 <w:sz w:val="28"/>
                 <w:szCs w:val="28"/>
-                <w:lang w:val="ru-RU"/>
               </w:rPr>
             </w:pPr>
             <w:r>
@@ -9437,7 +9260,6 @@
                 <w:bCs/>
                 <w:sz w:val="28"/>
                 <w:szCs w:val="28"/>
-                <w:lang w:val="ru-RU"/>
               </w:rPr>
               <w:t>Имя поля</w:t>
             </w:r>
@@ -9467,7 +9289,6 @@
               <w:rPr>
                 <w:sz w:val="28"/>
                 <w:szCs w:val="28"/>
-                <w:lang w:val="ru-RU"/>
               </w:rPr>
             </w:pPr>
             <w:r>
@@ -9476,7 +9297,6 @@
                 <w:bCs/>
                 <w:sz w:val="28"/>
                 <w:szCs w:val="28"/>
-                <w:lang w:val="ru-RU"/>
               </w:rPr>
               <w:t>Тип данных</w:t>
             </w:r>
@@ -9506,7 +9326,6 @@
               <w:rPr>
                 <w:sz w:val="28"/>
                 <w:szCs w:val="28"/>
-                <w:lang w:val="ru-RU"/>
               </w:rPr>
             </w:pPr>
             <w:r>
@@ -9515,7 +9334,6 @@
                 <w:bCs/>
                 <w:sz w:val="28"/>
                 <w:szCs w:val="28"/>
-                <w:lang w:val="ru-RU"/>
               </w:rPr>
               <w:t>Описание</w:t>
             </w:r>
@@ -9545,7 +9363,6 @@
               <w:rPr>
                 <w:sz w:val="28"/>
                 <w:szCs w:val="28"/>
-                <w:lang w:val="ru-RU"/>
               </w:rPr>
             </w:pPr>
             <w:r>
@@ -9554,7 +9371,6 @@
                 <w:bCs/>
                 <w:sz w:val="28"/>
                 <w:szCs w:val="28"/>
-                <w:lang w:val="ru-RU"/>
               </w:rPr>
               <w:t>Ограничения</w:t>
             </w:r>
@@ -9589,14 +9405,12 @@
               <w:rPr>
                 <w:sz w:val="28"/>
                 <w:szCs w:val="28"/>
-                <w:lang w:val="ru-RU"/>
               </w:rPr>
             </w:pPr>
             <w:r>
               <w:rPr>
                 <w:sz w:val="28"/>
                 <w:szCs w:val="28"/>
-                <w:lang w:val="ru-RU"/>
               </w:rPr>
               <w:t>id</w:t>
             </w:r>
@@ -9626,14 +9440,12 @@
               <w:rPr>
                 <w:sz w:val="28"/>
                 <w:szCs w:val="28"/>
-                <w:lang w:val="ru-RU"/>
               </w:rPr>
             </w:pPr>
             <w:r>
               <w:rPr>
                 <w:sz w:val="28"/>
                 <w:szCs w:val="28"/>
-                <w:lang w:val="ru-RU"/>
               </w:rPr>
               <w:t>INTEGER</w:t>
             </w:r>
@@ -9663,14 +9475,12 @@
               <w:rPr>
                 <w:sz w:val="28"/>
                 <w:szCs w:val="28"/>
-                <w:lang w:val="ru-RU"/>
               </w:rPr>
             </w:pPr>
             <w:r>
               <w:rPr>
                 <w:sz w:val="28"/>
                 <w:szCs w:val="28"/>
-                <w:lang w:val="ru-RU"/>
               </w:rPr>
               <w:t>Идентификатор блока</w:t>
             </w:r>
@@ -9700,14 +9510,12 @@
               <w:rPr>
                 <w:sz w:val="28"/>
                 <w:szCs w:val="28"/>
-                <w:lang w:val="ru-RU"/>
               </w:rPr>
             </w:pPr>
             <w:r>
               <w:rPr>
                 <w:sz w:val="28"/>
                 <w:szCs w:val="28"/>
-                <w:lang w:val="ru-RU"/>
               </w:rPr>
               <w:t>Primary Key, Auto Increment</w:t>
             </w:r>
@@ -9742,14 +9550,12 @@
               <w:rPr>
                 <w:sz w:val="28"/>
                 <w:szCs w:val="28"/>
-                <w:lang w:val="ru-RU"/>
               </w:rPr>
             </w:pPr>
             <w:r>
               <w:rPr>
                 <w:sz w:val="28"/>
                 <w:szCs w:val="28"/>
-                <w:lang w:val="ru-RU"/>
               </w:rPr>
               <w:lastRenderedPageBreak/>
               <w:t>entry_id</w:t>
@@ -9780,14 +9586,12 @@
               <w:rPr>
                 <w:sz w:val="28"/>
                 <w:szCs w:val="28"/>
-                <w:lang w:val="ru-RU"/>
               </w:rPr>
             </w:pPr>
             <w:r>
               <w:rPr>
                 <w:sz w:val="28"/>
                 <w:szCs w:val="28"/>
-                <w:lang w:val="ru-RU"/>
               </w:rPr>
               <w:t>TEXT</w:t>
             </w:r>
@@ -9817,14 +9621,12 @@
               <w:rPr>
                 <w:sz w:val="28"/>
                 <w:szCs w:val="28"/>
-                <w:lang w:val="ru-RU"/>
               </w:rPr>
             </w:pPr>
             <w:r>
               <w:rPr>
                 <w:sz w:val="28"/>
                 <w:szCs w:val="28"/>
-                <w:lang w:val="ru-RU"/>
               </w:rPr>
               <w:t>Ссылка на родительскую запись</w:t>
             </w:r>
@@ -9854,14 +9656,12 @@
               <w:rPr>
                 <w:sz w:val="28"/>
                 <w:szCs w:val="28"/>
-                <w:lang w:val="ru-RU"/>
               </w:rPr>
             </w:pPr>
             <w:r>
               <w:rPr>
                 <w:sz w:val="28"/>
                 <w:szCs w:val="28"/>
-                <w:lang w:val="ru-RU"/>
               </w:rPr>
               <w:t>Foreign Key (entries.id)</w:t>
             </w:r>
@@ -9896,14 +9696,12 @@
               <w:rPr>
                 <w:sz w:val="28"/>
                 <w:szCs w:val="28"/>
-                <w:lang w:val="ru-RU"/>
               </w:rPr>
             </w:pPr>
             <w:r>
               <w:rPr>
                 <w:sz w:val="28"/>
                 <w:szCs w:val="28"/>
-                <w:lang w:val="ru-RU"/>
               </w:rPr>
               <w:t>type</w:t>
             </w:r>
@@ -9933,14 +9731,12 @@
               <w:rPr>
                 <w:sz w:val="28"/>
                 <w:szCs w:val="28"/>
-                <w:lang w:val="ru-RU"/>
               </w:rPr>
             </w:pPr>
             <w:r>
               <w:rPr>
                 <w:sz w:val="28"/>
                 <w:szCs w:val="28"/>
-                <w:lang w:val="ru-RU"/>
               </w:rPr>
               <w:t>TEXT</w:t>
             </w:r>
@@ -9970,14 +9766,12 @@
               <w:rPr>
                 <w:sz w:val="28"/>
                 <w:szCs w:val="28"/>
-                <w:lang w:val="ru-RU"/>
               </w:rPr>
             </w:pPr>
             <w:r>
               <w:rPr>
                 <w:sz w:val="28"/>
                 <w:szCs w:val="28"/>
-                <w:lang w:val="ru-RU"/>
               </w:rPr>
               <w:t>Тип блока (text или image)</w:t>
             </w:r>
@@ -10007,14 +9801,12 @@
               <w:rPr>
                 <w:sz w:val="28"/>
                 <w:szCs w:val="28"/>
-                <w:lang w:val="ru-RU"/>
               </w:rPr>
             </w:pPr>
             <w:r>
               <w:rPr>
                 <w:sz w:val="28"/>
                 <w:szCs w:val="28"/>
-                <w:lang w:val="ru-RU"/>
               </w:rPr>
               <w:t>Not Null</w:t>
             </w:r>
@@ -10049,14 +9841,12 @@
               <w:rPr>
                 <w:sz w:val="28"/>
                 <w:szCs w:val="28"/>
-                <w:lang w:val="ru-RU"/>
               </w:rPr>
             </w:pPr>
             <w:r>
               <w:rPr>
                 <w:sz w:val="28"/>
                 <w:szCs w:val="28"/>
-                <w:lang w:val="ru-RU"/>
               </w:rPr>
               <w:t>value</w:t>
             </w:r>
@@ -10086,14 +9876,12 @@
               <w:rPr>
                 <w:sz w:val="28"/>
                 <w:szCs w:val="28"/>
-                <w:lang w:val="ru-RU"/>
               </w:rPr>
             </w:pPr>
             <w:r>
               <w:rPr>
                 <w:sz w:val="28"/>
                 <w:szCs w:val="28"/>
-                <w:lang w:val="ru-RU"/>
               </w:rPr>
               <w:t>TEXT</w:t>
             </w:r>
@@ -10123,14 +9911,12 @@
               <w:rPr>
                 <w:sz w:val="28"/>
                 <w:szCs w:val="28"/>
-                <w:lang w:val="ru-RU"/>
               </w:rPr>
             </w:pPr>
             <w:r>
               <w:rPr>
                 <w:sz w:val="28"/>
                 <w:szCs w:val="28"/>
-                <w:lang w:val="ru-RU"/>
               </w:rPr>
               <w:t>Содержимое блока (текст или путь к файлу изображения)</w:t>
             </w:r>
@@ -10160,14 +9946,12 @@
               <w:rPr>
                 <w:sz w:val="28"/>
                 <w:szCs w:val="28"/>
-                <w:lang w:val="ru-RU"/>
               </w:rPr>
             </w:pPr>
             <w:r>
               <w:rPr>
                 <w:sz w:val="28"/>
                 <w:szCs w:val="28"/>
-                <w:lang w:val="ru-RU"/>
               </w:rPr>
               <w:t>Not Null</w:t>
             </w:r>
@@ -10202,14 +9986,12 @@
               <w:rPr>
                 <w:sz w:val="28"/>
                 <w:szCs w:val="28"/>
-                <w:lang w:val="ru-RU"/>
               </w:rPr>
             </w:pPr>
             <w:r>
               <w:rPr>
                 <w:sz w:val="28"/>
                 <w:szCs w:val="28"/>
-                <w:lang w:val="ru-RU"/>
               </w:rPr>
               <w:t>order_index</w:t>
             </w:r>
@@ -10239,14 +10021,12 @@
               <w:rPr>
                 <w:sz w:val="28"/>
                 <w:szCs w:val="28"/>
-                <w:lang w:val="ru-RU"/>
               </w:rPr>
             </w:pPr>
             <w:r>
               <w:rPr>
                 <w:sz w:val="28"/>
                 <w:szCs w:val="28"/>
-                <w:lang w:val="ru-RU"/>
               </w:rPr>
               <w:t>INTEGER</w:t>
             </w:r>
@@ -10276,14 +10056,12 @@
               <w:rPr>
                 <w:sz w:val="28"/>
                 <w:szCs w:val="28"/>
-                <w:lang w:val="ru-RU"/>
               </w:rPr>
             </w:pPr>
             <w:r>
               <w:rPr>
                 <w:sz w:val="28"/>
                 <w:szCs w:val="28"/>
-                <w:lang w:val="ru-RU"/>
               </w:rPr>
               <w:t>Порядковый номер блока для сохранения правильной сортировки при отображении</w:t>
             </w:r>
@@ -10313,14 +10091,12 @@
               <w:rPr>
                 <w:sz w:val="28"/>
                 <w:szCs w:val="28"/>
-                <w:lang w:val="ru-RU"/>
               </w:rPr>
             </w:pPr>
             <w:r>
               <w:rPr>
                 <w:sz w:val="28"/>
                 <w:szCs w:val="28"/>
-                <w:lang w:val="ru-RU"/>
               </w:rPr>
               <w:t>Not Null</w:t>
             </w:r>
@@ -10378,15 +10154,13 @@
           <w:color w:val="000000"/>
           <w:sz w:val="28"/>
           <w:szCs w:val="28"/>
-          <w:lang w:val="ru-RU"/>
-        </w:rPr>
-      </w:pPr>
-      <w:r>
-        <w:rPr>
-          <w:color w:val="000000"/>
-          <w:sz w:val="28"/>
-          <w:szCs w:val="28"/>
-          <w:lang w:val="ru-RU"/>
+        </w:rPr>
+      </w:pPr>
+      <w:r>
+        <w:rPr>
+          <w:color w:val="000000"/>
+          <w:sz w:val="28"/>
+          <w:szCs w:val="28"/>
         </w:rPr>
         <w:t>Таблица хранит информацию о декоративных стикерах и их точном положении (координатах) на экране для конкретной записи.</w:t>
       </w:r>
@@ -10407,15 +10181,13 @@
           <w:color w:val="000000"/>
           <w:sz w:val="28"/>
           <w:szCs w:val="28"/>
-          <w:lang w:val="ru-RU"/>
-        </w:rPr>
-      </w:pPr>
-      <w:r>
-        <w:rPr>
-          <w:color w:val="000000"/>
-          <w:sz w:val="28"/>
-          <w:szCs w:val="28"/>
-          <w:lang w:val="ru-RU"/>
+        </w:rPr>
+      </w:pPr>
+      <w:r>
+        <w:rPr>
+          <w:color w:val="000000"/>
+          <w:sz w:val="28"/>
+          <w:szCs w:val="28"/>
         </w:rPr>
         <w:t>Таблица 3 – Спецификация таблицы «stickers»</w:t>
       </w:r>
@@ -10467,7 +10239,6 @@
               <w:rPr>
                 <w:sz w:val="28"/>
                 <w:szCs w:val="28"/>
-                <w:lang w:val="ru-RU"/>
               </w:rPr>
             </w:pPr>
             <w:r>
@@ -10476,7 +10247,6 @@
                 <w:bCs/>
                 <w:sz w:val="28"/>
                 <w:szCs w:val="28"/>
-                <w:lang w:val="ru-RU"/>
               </w:rPr>
               <w:t>Имя поля</w:t>
             </w:r>
@@ -10506,7 +10276,6 @@
               <w:rPr>
                 <w:sz w:val="28"/>
                 <w:szCs w:val="28"/>
-                <w:lang w:val="ru-RU"/>
               </w:rPr>
             </w:pPr>
             <w:r>
@@ -10515,7 +10284,6 @@
                 <w:bCs/>
                 <w:sz w:val="28"/>
                 <w:szCs w:val="28"/>
-                <w:lang w:val="ru-RU"/>
               </w:rPr>
               <w:t>Тип данных</w:t>
             </w:r>
@@ -10545,7 +10313,6 @@
               <w:rPr>
                 <w:sz w:val="28"/>
                 <w:szCs w:val="28"/>
-                <w:lang w:val="ru-RU"/>
               </w:rPr>
             </w:pPr>
             <w:r>
@@ -10554,7 +10321,6 @@
                 <w:bCs/>
                 <w:sz w:val="28"/>
                 <w:szCs w:val="28"/>
-                <w:lang w:val="ru-RU"/>
               </w:rPr>
               <w:t>Описание</w:t>
             </w:r>
@@ -10584,7 +10350,6 @@
               <w:rPr>
                 <w:sz w:val="28"/>
                 <w:szCs w:val="28"/>
-                <w:lang w:val="ru-RU"/>
               </w:rPr>
             </w:pPr>
             <w:r>
@@ -10593,7 +10358,6 @@
                 <w:bCs/>
                 <w:sz w:val="28"/>
                 <w:szCs w:val="28"/>
-                <w:lang w:val="ru-RU"/>
               </w:rPr>
               <w:t>Ограничения</w:t>
             </w:r>
@@ -10628,14 +10392,12 @@
               <w:rPr>
                 <w:sz w:val="28"/>
                 <w:szCs w:val="28"/>
-                <w:lang w:val="ru-RU"/>
               </w:rPr>
             </w:pPr>
             <w:r>
               <w:rPr>
                 <w:sz w:val="28"/>
                 <w:szCs w:val="28"/>
-                <w:lang w:val="ru-RU"/>
               </w:rPr>
               <w:t>id</w:t>
             </w:r>
@@ -10665,14 +10427,12 @@
               <w:rPr>
                 <w:sz w:val="28"/>
                 <w:szCs w:val="28"/>
-                <w:lang w:val="ru-RU"/>
               </w:rPr>
             </w:pPr>
             <w:r>
               <w:rPr>
                 <w:sz w:val="28"/>
                 <w:szCs w:val="28"/>
-                <w:lang w:val="ru-RU"/>
               </w:rPr>
               <w:t>TEXT</w:t>
             </w:r>
@@ -10702,14 +10462,12 @@
               <w:rPr>
                 <w:sz w:val="28"/>
                 <w:szCs w:val="28"/>
-                <w:lang w:val="ru-RU"/>
               </w:rPr>
             </w:pPr>
             <w:r>
               <w:rPr>
                 <w:sz w:val="28"/>
                 <w:szCs w:val="28"/>
-                <w:lang w:val="ru-RU"/>
               </w:rPr>
               <w:t>Уникальный идентификатор стикера</w:t>
             </w:r>
@@ -10739,14 +10497,12 @@
               <w:rPr>
                 <w:sz w:val="28"/>
                 <w:szCs w:val="28"/>
-                <w:lang w:val="ru-RU"/>
               </w:rPr>
             </w:pPr>
             <w:r>
               <w:rPr>
                 <w:sz w:val="28"/>
                 <w:szCs w:val="28"/>
-                <w:lang w:val="ru-RU"/>
               </w:rPr>
               <w:t>Primary Key, Not Null</w:t>
             </w:r>
@@ -10781,14 +10537,12 @@
               <w:rPr>
                 <w:sz w:val="28"/>
                 <w:szCs w:val="28"/>
-                <w:lang w:val="ru-RU"/>
               </w:rPr>
             </w:pPr>
             <w:r>
               <w:rPr>
                 <w:sz w:val="28"/>
                 <w:szCs w:val="28"/>
-                <w:lang w:val="ru-RU"/>
               </w:rPr>
               <w:t>entry_id</w:t>
             </w:r>
@@ -10818,14 +10572,12 @@
               <w:rPr>
                 <w:sz w:val="28"/>
                 <w:szCs w:val="28"/>
-                <w:lang w:val="ru-RU"/>
               </w:rPr>
             </w:pPr>
             <w:r>
               <w:rPr>
                 <w:sz w:val="28"/>
                 <w:szCs w:val="28"/>
-                <w:lang w:val="ru-RU"/>
               </w:rPr>
               <w:t>TEXT</w:t>
             </w:r>
@@ -10855,14 +10607,12 @@
               <w:rPr>
                 <w:sz w:val="28"/>
                 <w:szCs w:val="28"/>
-                <w:lang w:val="ru-RU"/>
               </w:rPr>
             </w:pPr>
             <w:r>
               <w:rPr>
                 <w:sz w:val="28"/>
                 <w:szCs w:val="28"/>
-                <w:lang w:val="ru-RU"/>
               </w:rPr>
               <w:t>Ссылка на родительскую запись</w:t>
             </w:r>
@@ -10892,14 +10642,12 @@
               <w:rPr>
                 <w:sz w:val="28"/>
                 <w:szCs w:val="28"/>
-                <w:lang w:val="ru-RU"/>
               </w:rPr>
             </w:pPr>
             <w:r>
               <w:rPr>
                 <w:sz w:val="28"/>
                 <w:szCs w:val="28"/>
-                <w:lang w:val="ru-RU"/>
               </w:rPr>
               <w:t>Foreign Key (entries.id)</w:t>
             </w:r>
@@ -10934,14 +10682,12 @@
               <w:rPr>
                 <w:sz w:val="28"/>
                 <w:szCs w:val="28"/>
-                <w:lang w:val="ru-RU"/>
               </w:rPr>
             </w:pPr>
             <w:r>
               <w:rPr>
                 <w:sz w:val="28"/>
                 <w:szCs w:val="28"/>
-                <w:lang w:val="ru-RU"/>
               </w:rPr>
               <w:t>emoji</w:t>
             </w:r>
@@ -10971,14 +10717,12 @@
               <w:rPr>
                 <w:sz w:val="28"/>
                 <w:szCs w:val="28"/>
-                <w:lang w:val="ru-RU"/>
               </w:rPr>
             </w:pPr>
             <w:r>
               <w:rPr>
                 <w:sz w:val="28"/>
                 <w:szCs w:val="28"/>
-                <w:lang w:val="ru-RU"/>
               </w:rPr>
               <w:t>TEXT</w:t>
             </w:r>
@@ -11008,14 +10752,12 @@
               <w:rPr>
                 <w:sz w:val="28"/>
                 <w:szCs w:val="28"/>
-                <w:lang w:val="ru-RU"/>
               </w:rPr>
             </w:pPr>
             <w:r>
               <w:rPr>
                 <w:sz w:val="28"/>
                 <w:szCs w:val="28"/>
-                <w:lang w:val="ru-RU"/>
               </w:rPr>
               <w:t>Символ эмодзи</w:t>
             </w:r>
@@ -11045,14 +10787,12 @@
               <w:rPr>
                 <w:sz w:val="28"/>
                 <w:szCs w:val="28"/>
-                <w:lang w:val="ru-RU"/>
               </w:rPr>
             </w:pPr>
             <w:r>
               <w:rPr>
                 <w:sz w:val="28"/>
                 <w:szCs w:val="28"/>
-                <w:lang w:val="ru-RU"/>
               </w:rPr>
               <w:t>Not Null</w:t>
             </w:r>
@@ -11087,14 +10827,12 @@
               <w:rPr>
                 <w:sz w:val="28"/>
                 <w:szCs w:val="28"/>
-                <w:lang w:val="ru-RU"/>
               </w:rPr>
             </w:pPr>
             <w:r>
               <w:rPr>
                 <w:sz w:val="28"/>
                 <w:szCs w:val="28"/>
-                <w:lang w:val="ru-RU"/>
               </w:rPr>
               <w:lastRenderedPageBreak/>
               <w:t>pos_x</w:t>
@@ -11125,14 +10863,12 @@
               <w:rPr>
                 <w:sz w:val="28"/>
                 <w:szCs w:val="28"/>
-                <w:lang w:val="ru-RU"/>
               </w:rPr>
             </w:pPr>
             <w:r>
               <w:rPr>
                 <w:sz w:val="28"/>
                 <w:szCs w:val="28"/>
-                <w:lang w:val="ru-RU"/>
               </w:rPr>
               <w:t>REAL</w:t>
             </w:r>
@@ -11162,14 +10898,12 @@
               <w:rPr>
                 <w:sz w:val="28"/>
                 <w:szCs w:val="28"/>
-                <w:lang w:val="ru-RU"/>
               </w:rPr>
             </w:pPr>
             <w:r>
               <w:rPr>
                 <w:sz w:val="28"/>
                 <w:szCs w:val="28"/>
-                <w:lang w:val="ru-RU"/>
               </w:rPr>
               <w:t>Координата X на холсте экрана</w:t>
             </w:r>
@@ -11199,14 +10933,12 @@
               <w:rPr>
                 <w:sz w:val="28"/>
                 <w:szCs w:val="28"/>
-                <w:lang w:val="ru-RU"/>
               </w:rPr>
             </w:pPr>
             <w:r>
               <w:rPr>
                 <w:sz w:val="28"/>
                 <w:szCs w:val="28"/>
-                <w:lang w:val="ru-RU"/>
               </w:rPr>
               <w:t>Not Null</w:t>
             </w:r>
@@ -11241,14 +10973,12 @@
               <w:rPr>
                 <w:sz w:val="28"/>
                 <w:szCs w:val="28"/>
-                <w:lang w:val="ru-RU"/>
               </w:rPr>
             </w:pPr>
             <w:r>
               <w:rPr>
                 <w:sz w:val="28"/>
                 <w:szCs w:val="28"/>
-                <w:lang w:val="ru-RU"/>
               </w:rPr>
               <w:t>pos_y</w:t>
             </w:r>
@@ -11278,14 +11008,12 @@
               <w:rPr>
                 <w:sz w:val="28"/>
                 <w:szCs w:val="28"/>
-                <w:lang w:val="ru-RU"/>
               </w:rPr>
             </w:pPr>
             <w:r>
               <w:rPr>
                 <w:sz w:val="28"/>
                 <w:szCs w:val="28"/>
-                <w:lang w:val="ru-RU"/>
               </w:rPr>
               <w:t>REAL</w:t>
             </w:r>
@@ -11315,14 +11043,12 @@
               <w:rPr>
                 <w:sz w:val="28"/>
                 <w:szCs w:val="28"/>
-                <w:lang w:val="ru-RU"/>
               </w:rPr>
             </w:pPr>
             <w:r>
               <w:rPr>
                 <w:sz w:val="28"/>
                 <w:szCs w:val="28"/>
-                <w:lang w:val="ru-RU"/>
               </w:rPr>
               <w:t>Координата Y на холсте экрана</w:t>
             </w:r>
@@ -11352,14 +11078,12 @@
               <w:rPr>
                 <w:sz w:val="28"/>
                 <w:szCs w:val="28"/>
-                <w:lang w:val="ru-RU"/>
               </w:rPr>
             </w:pPr>
             <w:r>
               <w:rPr>
                 <w:sz w:val="28"/>
                 <w:szCs w:val="28"/>
-                <w:lang w:val="ru-RU"/>
               </w:rPr>
               <w:t>Not Null</w:t>
             </w:r>
@@ -11417,15 +11141,13 @@
           <w:color w:val="000000"/>
           <w:sz w:val="28"/>
           <w:szCs w:val="28"/>
-          <w:lang w:val="ru-RU"/>
-        </w:rPr>
-      </w:pPr>
-      <w:r>
-        <w:rPr>
-          <w:color w:val="000000"/>
-          <w:sz w:val="28"/>
-          <w:szCs w:val="28"/>
-          <w:lang w:val="ru-RU"/>
+        </w:rPr>
+      </w:pPr>
+      <w:r>
+        <w:rPr>
+          <w:color w:val="000000"/>
+          <w:sz w:val="28"/>
+          <w:szCs w:val="28"/>
         </w:rPr>
         <w:t>Между таблицами установлена идентифицирующая связь типа «один-ко-многим» (1:M):</w:t>
       </w:r>
@@ -11548,15 +11270,13 @@
           <w:color w:val="000000"/>
           <w:sz w:val="28"/>
           <w:szCs w:val="28"/>
-          <w:lang w:val="ru-RU"/>
-        </w:rPr>
-      </w:pPr>
-      <w:r>
-        <w:rPr>
-          <w:color w:val="000000"/>
-          <w:sz w:val="28"/>
-          <w:szCs w:val="28"/>
-          <w:lang w:val="ru-RU"/>
+        </w:rPr>
+      </w:pPr>
+      <w:r>
+        <w:rPr>
+          <w:color w:val="000000"/>
+          <w:sz w:val="28"/>
+          <w:szCs w:val="28"/>
         </w:rPr>
         <w:t>Таблица находится в первой нормальной форме тогда и только тогда, когда в любом допустимом значении отношения каждый кортеж содержит только одно значение для каждого из атрибутов (атомарность данных).</w:t>
       </w:r>
@@ -11577,15 +11297,13 @@
           <w:color w:val="000000"/>
           <w:sz w:val="28"/>
           <w:szCs w:val="28"/>
-          <w:lang w:val="ru-RU"/>
-        </w:rPr>
-      </w:pPr>
-      <w:r>
-        <w:rPr>
-          <w:color w:val="000000"/>
-          <w:sz w:val="28"/>
-          <w:szCs w:val="28"/>
-          <w:lang w:val="ru-RU"/>
+        </w:rPr>
+      </w:pPr>
+      <w:r>
+        <w:rPr>
+          <w:color w:val="000000"/>
+          <w:sz w:val="28"/>
+          <w:szCs w:val="28"/>
         </w:rPr>
         <w:t>При проектировании базы данных приложения «My Diary» были соблюдены следующие условия:</w:t>
       </w:r>
@@ -11743,15 +11461,13 @@
           <w:color w:val="000000"/>
           <w:sz w:val="28"/>
           <w:szCs w:val="28"/>
-          <w:lang w:val="ru-RU"/>
-        </w:rPr>
-      </w:pPr>
-      <w:r>
-        <w:rPr>
-          <w:color w:val="000000"/>
-          <w:sz w:val="28"/>
-          <w:szCs w:val="28"/>
-          <w:lang w:val="ru-RU"/>
+        </w:rPr>
+      </w:pPr>
+      <w:r>
+        <w:rPr>
+          <w:color w:val="000000"/>
+          <w:sz w:val="28"/>
+          <w:szCs w:val="28"/>
         </w:rPr>
         <w:t>Таблица находится во второй нормальной форме, если она находится в 1НФ и каждый неключевой атрибут функционально полно зависит от первичного ключа.</w:t>
       </w:r>
@@ -11772,15 +11488,13 @@
           <w:color w:val="000000"/>
           <w:sz w:val="28"/>
           <w:szCs w:val="28"/>
-          <w:lang w:val="ru-RU"/>
-        </w:rPr>
-      </w:pPr>
-      <w:r>
-        <w:rPr>
-          <w:color w:val="000000"/>
-          <w:sz w:val="28"/>
-          <w:szCs w:val="28"/>
-          <w:lang w:val="ru-RU"/>
+        </w:rPr>
+      </w:pPr>
+      <w:r>
+        <w:rPr>
+          <w:color w:val="000000"/>
+          <w:sz w:val="28"/>
+          <w:szCs w:val="28"/>
         </w:rPr>
         <w:t>В спроектированной базе данных это реализовано следующим образом:</w:t>
       </w:r>
@@ -11869,15 +11583,13 @@
           <w:color w:val="000000"/>
           <w:sz w:val="28"/>
           <w:szCs w:val="28"/>
-          <w:lang w:val="ru-RU"/>
-        </w:rPr>
-      </w:pPr>
-      <w:r>
-        <w:rPr>
-          <w:color w:val="000000"/>
-          <w:sz w:val="28"/>
-          <w:szCs w:val="28"/>
-          <w:lang w:val="ru-RU"/>
+        </w:rPr>
+      </w:pPr>
+      <w:r>
+        <w:rPr>
+          <w:color w:val="000000"/>
+          <w:sz w:val="28"/>
+          <w:szCs w:val="28"/>
         </w:rPr>
         <w:t>Таблица находится в третьей нормальной форме, если она находится во 2НФ и в ней отсутствуют транзитивные зависимости неключевых атрибутов от первичного ключа (неключевые поля не должны зависеть от других неключевых полей).</w:t>
       </w:r>
@@ -11898,15 +11610,13 @@
           <w:color w:val="000000"/>
           <w:sz w:val="28"/>
           <w:szCs w:val="28"/>
-          <w:lang w:val="ru-RU"/>
-        </w:rPr>
-      </w:pPr>
-      <w:r>
-        <w:rPr>
-          <w:color w:val="000000"/>
-          <w:sz w:val="28"/>
-          <w:szCs w:val="28"/>
-          <w:lang w:val="ru-RU"/>
+        </w:rPr>
+      </w:pPr>
+      <w:r>
+        <w:rPr>
+          <w:color w:val="000000"/>
+          <w:sz w:val="28"/>
+          <w:szCs w:val="28"/>
         </w:rPr>
         <w:t>Анализ структуры БД подтверждает отсутствие транзитивных зависимостей:</w:t>
       </w:r>
@@ -11986,14 +11696,12 @@
         <w:rPr>
           <w:sz w:val="28"/>
           <w:szCs w:val="28"/>
-          <w:lang w:val="ru-RU"/>
-        </w:rPr>
-      </w:pPr>
-      <w:r>
-        <w:rPr>
-          <w:sz w:val="28"/>
-          <w:szCs w:val="28"/>
-          <w:lang w:val="ru-RU"/>
+        </w:rPr>
+      </w:pPr>
+      <w:r>
+        <w:rPr>
+          <w:sz w:val="28"/>
+          <w:szCs w:val="28"/>
         </w:rPr>
         <w:br w:type="page"/>
       </w:r>
@@ -12089,15 +11797,13 @@
           <w:color w:val="000000"/>
           <w:sz w:val="28"/>
           <w:szCs w:val="28"/>
-          <w:lang w:val="ru-RU"/>
-        </w:rPr>
-      </w:pPr>
-      <w:r>
-        <w:rPr>
-          <w:color w:val="000000"/>
-          <w:sz w:val="28"/>
-          <w:szCs w:val="28"/>
-          <w:lang w:val="ru-RU"/>
+        </w:rPr>
+      </w:pPr>
+      <w:r>
+        <w:rPr>
+          <w:color w:val="000000"/>
+          <w:sz w:val="28"/>
+          <w:szCs w:val="28"/>
         </w:rPr>
         <w:t>Клиентская часть кроссплатформенного приложения «My Diary» отвечает за построение графического интерфейса пользователя, управление состоянием (State Management), обработку пользовательских событий и адаптивный рендеринг компонентов. Продукт разработан на базе современного фреймворка Flutter с использованием объектно-ориентированного языка программирования Dart.</w:t>
       </w:r>
@@ -12118,15 +11824,13 @@
           <w:color w:val="000000"/>
           <w:sz w:val="28"/>
           <w:szCs w:val="28"/>
-          <w:lang w:val="ru-RU"/>
-        </w:rPr>
-      </w:pPr>
-      <w:r>
-        <w:rPr>
-          <w:color w:val="000000"/>
-          <w:sz w:val="28"/>
-          <w:szCs w:val="28"/>
-          <w:lang w:val="ru-RU"/>
+        </w:rPr>
+      </w:pPr>
+      <w:r>
+        <w:rPr>
+          <w:color w:val="000000"/>
+          <w:sz w:val="28"/>
+          <w:szCs w:val="28"/>
         </w:rPr>
         <w:t>Точкой входа в приложение является асинхронная функция main(). В процессе инициализации выполняется обязательная привязка виджетов Flutter к коду нативной платформы посредством WidgetsFlutterBinding.ensureInitialized(), настраивается локализация дат для русского и английского языков через пакет intl, а также задаются фиксированные размеры графического окна для десктопных платформ (500x900 пикселей) с помощью пакета desktop_window. Такой подход позволяет сохранить портретную ориентацию мобильного интерфейса при запуске на персональных компьютерах под управлением Windows, macOS или Linux.</w:t>
       </w:r>
@@ -12147,15 +11851,13 @@
           <w:color w:val="000000"/>
           <w:sz w:val="28"/>
           <w:szCs w:val="28"/>
-          <w:lang w:val="ru-RU"/>
-        </w:rPr>
-      </w:pPr>
-      <w:r>
-        <w:rPr>
-          <w:color w:val="000000"/>
-          <w:sz w:val="28"/>
-          <w:szCs w:val="28"/>
-          <w:lang w:val="ru-RU"/>
+        </w:rPr>
+      </w:pPr>
+      <w:r>
+        <w:rPr>
+          <w:color w:val="000000"/>
+          <w:sz w:val="28"/>
+          <w:szCs w:val="28"/>
         </w:rPr>
         <w:t>Графический интерфейс состоит из двух ключевых экранных форм:</w:t>
       </w:r>
@@ -12534,15 +12236,13 @@
           <w:color w:val="000000"/>
           <w:sz w:val="28"/>
           <w:szCs w:val="28"/>
-          <w:lang w:val="ru-RU"/>
-        </w:rPr>
-      </w:pPr>
-      <w:r>
-        <w:rPr>
-          <w:color w:val="000000"/>
-          <w:sz w:val="28"/>
-          <w:szCs w:val="28"/>
-          <w:lang w:val="ru-RU"/>
+        </w:rPr>
+      </w:pPr>
+      <w:r>
+        <w:rPr>
+          <w:color w:val="000000"/>
+          <w:sz w:val="28"/>
+          <w:szCs w:val="28"/>
         </w:rPr>
         <w:t>Поскольку приложение «My Diary» спроектировано в соответствии с архитектурным шаблоном Offline-first (автономная работа без обязательного подключения к удаленным серверам), серверная логика вынесена на локальный уровень устройства пользователя. Внутренняя часть продукта отвечает за долговременное хранение (персистентность) данных, сериализацию объектов и управление кэшированием.</w:t>
       </w:r>
@@ -12563,15 +12263,13 @@
           <w:color w:val="000000"/>
           <w:sz w:val="28"/>
           <w:szCs w:val="28"/>
-          <w:lang w:val="ru-RU"/>
-        </w:rPr>
-      </w:pPr>
-      <w:r>
-        <w:rPr>
-          <w:color w:val="000000"/>
-          <w:sz w:val="28"/>
-          <w:szCs w:val="28"/>
-          <w:lang w:val="ru-RU"/>
+        </w:rPr>
+      </w:pPr>
+      <w:r>
+        <w:rPr>
+          <w:color w:val="000000"/>
+          <w:sz w:val="28"/>
+          <w:szCs w:val="28"/>
         </w:rPr>
         <w:t>Хранение информации реализовано посредством интеграции с системным хранилищем устройства через пакет SharedPreferences. Локальная серверная логика включает в себя три основных компонента:</w:t>
       </w:r>
@@ -12799,14 +12497,12 @@
         <w:rPr>
           <w:sz w:val="28"/>
           <w:szCs w:val="28"/>
-          <w:lang w:val="ru-RU"/>
-        </w:rPr>
-      </w:pPr>
-      <w:r>
-        <w:rPr>
-          <w:sz w:val="28"/>
-          <w:szCs w:val="28"/>
-          <w:lang w:val="ru-RU"/>
+        </w:rPr>
+      </w:pPr>
+      <w:r>
+        <w:rPr>
+          <w:sz w:val="28"/>
+          <w:szCs w:val="28"/>
         </w:rPr>
         <w:br w:type="page"/>
       </w:r>
@@ -12829,7 +12525,6 @@
           <w:color w:val="000000"/>
           <w:sz w:val="28"/>
           <w:szCs w:val="28"/>
-          <w:lang w:val="ru-RU"/>
         </w:rPr>
       </w:pPr>
       <w:bookmarkStart w:id="42" w:name="_Toc230714495"/>
@@ -12859,14 +12554,12 @@
         <w:rPr>
           <w:sz w:val="28"/>
           <w:szCs w:val="28"/>
-          <w:lang w:val="ru-RU"/>
-        </w:rPr>
-      </w:pPr>
-      <w:r>
-        <w:rPr>
-          <w:sz w:val="28"/>
-          <w:szCs w:val="28"/>
-          <w:lang w:val="ru-RU"/>
+        </w:rPr>
+      </w:pPr>
+      <w:r>
+        <w:rPr>
+          <w:sz w:val="28"/>
+          <w:szCs w:val="28"/>
         </w:rPr>
         <w:t>Разработка кроссплатформенного приложения «My Diary» потребовала адаптации пользовательского интерфейса как под управление мышью и клавиатурой на настольных операционных системах, так и под сенсорное (touch) управление на мобильных устройствах. Использование единой кодовой базы (Single Codebase) во Flutter позволило реализовать универсальные механизмы взаимодействия, корректно работающие на любой платформе.</w:t>
       </w:r>
@@ -12889,7 +12582,6 @@
           <w:color w:val="000000"/>
           <w:sz w:val="28"/>
           <w:szCs w:val="28"/>
-          <w:lang w:val="ru-RU"/>
         </w:rPr>
       </w:pPr>
       <w:bookmarkStart w:id="45" w:name="_Toc230714496"/>
@@ -12914,14 +12606,12 @@
         <w:rPr>
           <w:sz w:val="28"/>
           <w:szCs w:val="28"/>
-          <w:lang w:val="ru-RU"/>
-        </w:rPr>
-      </w:pPr>
-      <w:r>
-        <w:rPr>
-          <w:sz w:val="28"/>
-          <w:szCs w:val="28"/>
-          <w:lang w:val="ru-RU"/>
+        </w:rPr>
+      </w:pPr>
+      <w:r>
+        <w:rPr>
+          <w:sz w:val="28"/>
+          <w:szCs w:val="28"/>
         </w:rPr>
         <w:t>В мобильной версии приложения особое внимание уделено эргономике и обработке сложных жестов. Одной из главных интерактивных механик является система позиционирования и управления стикерами (эмодзи) на экране редактирования записи.</w:t>
       </w:r>
@@ -12934,14 +12624,12 @@
         <w:rPr>
           <w:sz w:val="28"/>
           <w:szCs w:val="28"/>
-          <w:lang w:val="ru-RU"/>
-        </w:rPr>
-      </w:pPr>
-      <w:r>
-        <w:rPr>
-          <w:sz w:val="28"/>
-          <w:szCs w:val="28"/>
-          <w:lang w:val="ru-RU"/>
+        </w:rPr>
+      </w:pPr>
+      <w:r>
+        <w:rPr>
+          <w:sz w:val="28"/>
+          <w:szCs w:val="28"/>
         </w:rPr>
         <w:t>Для обработки сенсорных событий применяется встроенный класс GestureDetector, оборачивающий каждый созданный стикер. Логика взаимодействия разделена на два основных потока:</w:t>
       </w:r>
@@ -13022,14 +12710,12 @@
         <w:rPr>
           <w:sz w:val="28"/>
           <w:szCs w:val="28"/>
-          <w:lang w:val="ru-RU"/>
-        </w:rPr>
-      </w:pPr>
-      <w:r>
-        <w:rPr>
-          <w:sz w:val="28"/>
-          <w:szCs w:val="28"/>
-          <w:lang w:val="ru-RU"/>
+        </w:rPr>
+      </w:pPr>
+      <w:r>
+        <w:rPr>
+          <w:sz w:val="28"/>
+          <w:szCs w:val="28"/>
         </w:rPr>
         <w:t xml:space="preserve">Дополнительно в приложение интегрирован механизм детального просмотра пользовательских изображений. При нажатии на прикрепленную </w:t>
       </w:r>
@@ -13037,7 +12723,6 @@
         <w:rPr>
           <w:sz w:val="28"/>
           <w:szCs w:val="28"/>
-          <w:lang w:val="ru-RU"/>
         </w:rPr>
         <w:lastRenderedPageBreak/>
         <w:t>картинку открывается полноэкранный режим, реализованный на базе компонента InteractiveViewer. Данный виджет аппаратно поддерживает мультитач-жесты масштабирования (Pinch-to-Zoom) и панорамирования (Pan), что критически важно для комфортного просмотра фотографий на небольших экранах смартфонов.</w:t>
@@ -13051,14 +12736,12 @@
         <w:rPr>
           <w:sz w:val="28"/>
           <w:szCs w:val="28"/>
-          <w:lang w:val="ru-RU"/>
-        </w:rPr>
-      </w:pPr>
-      <w:r>
-        <w:rPr>
-          <w:sz w:val="28"/>
-          <w:szCs w:val="28"/>
-          <w:lang w:val="ru-RU"/>
+        </w:rPr>
+      </w:pPr>
+      <w:r>
+        <w:rPr>
+          <w:sz w:val="28"/>
+          <w:szCs w:val="28"/>
         </w:rPr>
         <w:t>Для выбора новых стикеров классические всплывающие окна (Dialogs), характерные для ПК-версий программ, были заменены на нативный мобильный UX-паттерн — нижнюю шторку (showModalBottomSheet). Шторка содержит сетку доступных стикеров (GridView.builder), легко вызывается и смахивается одним пальцем, не перекрывая при этом верхнюю часть просматриваемого контента.</w:t>
       </w:r>
@@ -13081,7 +12764,6 @@
           <w:color w:val="000000"/>
           <w:sz w:val="28"/>
           <w:szCs w:val="28"/>
-          <w:lang w:val="ru-RU"/>
         </w:rPr>
       </w:pPr>
       <w:bookmarkStart w:id="46" w:name="_Toc230714497"/>
@@ -13106,14 +12788,12 @@
         <w:rPr>
           <w:sz w:val="28"/>
           <w:szCs w:val="28"/>
-          <w:lang w:val="ru-RU"/>
-        </w:rPr>
-      </w:pPr>
-      <w:r>
-        <w:rPr>
-          <w:sz w:val="28"/>
-          <w:szCs w:val="28"/>
-          <w:lang w:val="ru-RU"/>
+        </w:rPr>
+      </w:pPr>
+      <w:r>
+        <w:rPr>
+          <w:sz w:val="28"/>
+          <w:szCs w:val="28"/>
         </w:rPr>
         <w:t>Так как приложение рассчитано на запуск в гетерогенной среде (мобильные и десктопные платформы), на этапе инициализации в функции main() реализован программный контроль оконного пространства. С помощью пакета desktop_window задаются жесткие ограничения размеров окна приложения (500x900 пикселей). Это позволяет сохранить задуманные пропорции портретной ориентации при запуске на Windows или macOS. Чтобы этот код не вызывал критических ошибок компиляции на Android или iOS, вызов обернут в блок try-catch. На мобильных устройствах возникающее исключение безопасно перехватывается и игнорируется, позволяя интерфейсу корректно занять 100% доступной площади экрана.</w:t>
       </w:r>
@@ -13126,14 +12806,12 @@
         <w:rPr>
           <w:sz w:val="28"/>
           <w:szCs w:val="28"/>
-          <w:lang w:val="ru-RU"/>
-        </w:rPr>
-      </w:pPr>
-      <w:r>
-        <w:rPr>
-          <w:sz w:val="28"/>
-          <w:szCs w:val="28"/>
-          <w:lang w:val="ru-RU"/>
+        </w:rPr>
+      </w:pPr>
+      <w:r>
+        <w:rPr>
+          <w:sz w:val="28"/>
+          <w:szCs w:val="28"/>
         </w:rPr>
         <w:t>Для интеграции с операционной системой применяются следующие структурные решения:</w:t>
       </w:r>
@@ -13221,12 +12899,11 @@
         <w:rPr>
           <w:sz w:val="28"/>
           <w:szCs w:val="28"/>
-          <w:lang w:val="ru-RU"/>
         </w:rPr>
       </w:pPr>
     </w:p>
     <w:sectPr>
-      <w:footerReference w:type="default" r:id="rId8"/>
+      <w:footerReference w:type="default" r:id="rId10"/>
       <w:pgSz w:w="11906" w:h="16838"/>
       <w:pgMar w:top="1134" w:right="850" w:bottom="1134" w:left="1701" w:header="708" w:footer="708" w:gutter="0"/>
       <w:pgNumType w:start="1"/>
@@ -13285,9 +12962,8 @@
         <w:r>
           <w:rPr>
             <w:noProof/>
-            <w:lang w:val="ru-RU"/>
           </w:rPr>
-          <w:t>2</w:t>
+          <w:t>17</w:t>
         </w:r>
         <w:r>
           <w:fldChar w:fldCharType="end"/>
@@ -16240,9 +15916,6 @@
     <w:pPr>
       <w:spacing w:before="100" w:beforeAutospacing="1" w:after="100" w:afterAutospacing="1"/>
     </w:pPr>
-    <w:rPr>
-      <w:lang w:val="ru-RU"/>
-    </w:rPr>
   </w:style>
   <w:style w:type="character" w:customStyle="1" w:styleId="citation-133">
     <w:name w:val="citation-133"/>
@@ -16344,7 +16017,6 @@
     <w:rPr>
       <w:sz w:val="32"/>
       <w:szCs w:val="32"/>
-      <w:lang w:val="ru-RU"/>
     </w:rPr>
   </w:style>
   <w:style w:type="paragraph" w:styleId="11">
@@ -16535,7 +16207,7 @@
       <w:kern w:val="32"/>
       <w:sz w:val="28"/>
       <w:szCs w:val="28"/>
-      <w:lang w:val="ru-RU" w:eastAsia="en-US"/>
+      <w:lang w:eastAsia="en-US"/>
     </w:rPr>
   </w:style>
   <w:style w:type="character" w:customStyle="1" w:styleId="13">
@@ -16884,7 +16556,7 @@
   <a:extraClrSchemeLst/>
   <a:extLst>
     <a:ext uri="{05A4C25C-085E-4340-85A3-A5531E510DB2}">
-      <thm15:themeFamily xmlns:thm15="http://schemas.microsoft.com/office/thememl/2012/main" xmlns="" name="Office Theme" id="{2E142A2C-CD16-42D6-873A-C26D2A0506FA}" vid="{1BDDFF52-6CD6-40A5-AB3C-68EB2F1E4D0A}"/>
+      <thm15:themeFamily xmlns="" xmlns:thm15="http://schemas.microsoft.com/office/thememl/2012/main" name="Office Theme" id="{2E142A2C-CD16-42D6-873A-C26D2A0506FA}" vid="{1BDDFF52-6CD6-40A5-AB3C-68EB2F1E4D0A}"/>
     </a:ext>
   </a:extLst>
 </a:theme>

</xml_diff>